<commit_message>
Enterprise warranty platform: OEM catalog, C4 architecture, K8s/CI/CD, graph viz
- Expand OEM product catalog (10 OEM + 3 legacy) with PIM blueprint sync
- Add GraphRAG graph visualization APIs and Streamlit KG explorer
- Add warranty ontology extensions, parts predictor, diagnostic engine, claims workflow
- Add complete C4 model (L1-L4, deployment, dynamic views) and pipeline docs
- Add GitHub Actions CI/CD, Kubernetes manifests, Docker images
- Fix graph_visualization edges list bug blocking diagnosis subgraph
- Deprecate legacy architecture diagrams; add ERD and layer architecture views
</commit_message>
<xml_diff>
--- a/docs/01-Architecture-and-Solution-Design.docx
+++ b/docs/01-Architecture-and-Solution-Design.docx
@@ -104,7 +104,15 @@
         <w:spacing w:after="120"/>
       </w:pPr>
       <w:r>
-        <w:t xml:space="preserve">The current demo implementation (diagnostic-chatbot) validates this architecture using three appliance product lines (washing machine, dishwasher, microwave), synthetic enterprise-grade knowledge data, Neo4j graph storage, a graph-native diagnosis engine (no LLM required), Streamlit UI with customer chat and human agent dashboard, and JSON-based escalation persistence.</w:t>
+        <w:t xml:space="preserve">A reference demo implementation (diagnostic-chatbot) illustrates this architecture using three synthetic appliance product lines, mock enterprise fixtures, Neo4j, LangGraph, and Streamlit. The demo does not validate this design for any client — it shows one possible end-to-end flow for discussion.</w:t>
+      </w:r>
+    </w:p>
+    <w:p>
+      <w:pPr>
+        <w:spacing w:after="120"/>
+      </w:pPr>
+      <w:r>
+        <w:t xml:space="preserve">Nothing is validated: not the client's enterprise landscape, product catalog, data sources, contact center model, or the suitability of this technical approach at scale. See Document 11 (Assumptions Register) and Document 12 (Solution Approach &amp; Delivery Methodology) for the delivery method, rationale, and validation gates.</w:t>
       </w:r>
     </w:p>
     <w:p>
@@ -5965,7 +5973,2571 @@
         <w:pStyle w:val="Heading1"/>
       </w:pPr>
       <w:r>
-        <w:t xml:space="preserve">10. Conclusion</w:t>
+        <w:t xml:space="preserve">10. Prerequisites, Dependencies, Assumptions &amp; Risk Mitigation</w:t>
+      </w:r>
+    </w:p>
+    <w:p>
+      <w:pPr>
+        <w:pStyle w:val="Heading2"/>
+      </w:pPr>
+      <w:r>
+        <w:t xml:space="preserve">10.1 Prerequisites</w:t>
+      </w:r>
+    </w:p>
+    <w:tbl>
+      <w:tblPr>
+        <w:tblW w:type="dxa" w:w="9360"/>
+        <w:tblBorders>
+          <w:top w:val="single" w:color="auto" w:sz="4"/>
+          <w:left w:val="single" w:color="auto" w:sz="4"/>
+          <w:bottom w:val="single" w:color="auto" w:sz="4"/>
+          <w:right w:val="single" w:color="auto" w:sz="4"/>
+          <w:insideH w:val="single" w:color="auto" w:sz="4"/>
+          <w:insideV w:val="single" w:color="auto" w:sz="4"/>
+        </w:tblBorders>
+      </w:tblPr>
+      <w:tblGrid>
+        <w:gridCol w:w="2400"/>
+        <w:gridCol w:w="2000"/>
+        <w:gridCol w:w="4960"/>
+      </w:tblGrid>
+      <w:tr>
+        <w:tc>
+          <w:tcPr>
+            <w:tcW w:type="dxa" w:w="2400"/>
+            <w:tcBorders>
+              <w:top w:val="single" w:color="CCCCCC" w:sz="1"/>
+              <w:left w:val="single" w:color="CCCCCC" w:sz="1"/>
+              <w:bottom w:val="single" w:color="CCCCCC" w:sz="1"/>
+              <w:right w:val="single" w:color="CCCCCC" w:sz="1"/>
+            </w:tcBorders>
+            <w:shd w:fill="2E75B6" w:val="clear"/>
+            <w:tcMar>
+              <w:top w:type="dxa" w:w="80"/>
+              <w:left w:type="dxa" w:w="120"/>
+              <w:bottom w:type="dxa" w:w="80"/>
+              <w:right w:type="dxa" w:w="120"/>
+            </w:tcMar>
+          </w:tcPr>
+          <w:p>
+            <w:r>
+              <w:rPr>
+                <w:b/>
+                <w:bCs/>
+                <w:color w:val="FFFFFF"/>
+              </w:rPr>
+              <w:t xml:space="preserve">Requirement</w:t>
+            </w:r>
+          </w:p>
+        </w:tc>
+        <w:tc>
+          <w:tcPr>
+            <w:tcW w:type="dxa" w:w="2000"/>
+            <w:tcBorders>
+              <w:top w:val="single" w:color="CCCCCC" w:sz="1"/>
+              <w:left w:val="single" w:color="CCCCCC" w:sz="1"/>
+              <w:bottom w:val="single" w:color="CCCCCC" w:sz="1"/>
+              <w:right w:val="single" w:color="CCCCCC" w:sz="1"/>
+            </w:tcBorders>
+            <w:shd w:fill="2E75B6" w:val="clear"/>
+            <w:tcMar>
+              <w:top w:type="dxa" w:w="80"/>
+              <w:left w:type="dxa" w:w="120"/>
+              <w:bottom w:type="dxa" w:w="80"/>
+              <w:right w:type="dxa" w:w="120"/>
+            </w:tcMar>
+          </w:tcPr>
+          <w:p>
+            <w:r>
+              <w:rPr>
+                <w:b/>
+                <w:bCs/>
+                <w:color w:val="FFFFFF"/>
+              </w:rPr>
+              <w:t xml:space="preserve">Minimum</w:t>
+            </w:r>
+          </w:p>
+        </w:tc>
+        <w:tc>
+          <w:tcPr>
+            <w:tcW w:type="dxa" w:w="4960"/>
+            <w:tcBorders>
+              <w:top w:val="single" w:color="CCCCCC" w:sz="1"/>
+              <w:left w:val="single" w:color="CCCCCC" w:sz="1"/>
+              <w:bottom w:val="single" w:color="CCCCCC" w:sz="1"/>
+              <w:right w:val="single" w:color="CCCCCC" w:sz="1"/>
+            </w:tcBorders>
+            <w:shd w:fill="2E75B6" w:val="clear"/>
+            <w:tcMar>
+              <w:top w:type="dxa" w:w="80"/>
+              <w:left w:type="dxa" w:w="120"/>
+              <w:bottom w:type="dxa" w:w="80"/>
+              <w:right w:type="dxa" w:w="120"/>
+            </w:tcMar>
+          </w:tcPr>
+          <w:p>
+            <w:r>
+              <w:rPr>
+                <w:b/>
+                <w:bCs/>
+                <w:color w:val="FFFFFF"/>
+              </w:rPr>
+              <w:t xml:space="preserve">Notes</w:t>
+            </w:r>
+          </w:p>
+        </w:tc>
+      </w:tr>
+      <w:tr>
+        <w:tc>
+          <w:tcPr>
+            <w:tcW w:type="dxa" w:w="2400"/>
+            <w:tcBorders>
+              <w:top w:val="single" w:color="CCCCCC" w:sz="1"/>
+              <w:left w:val="single" w:color="CCCCCC" w:sz="1"/>
+              <w:bottom w:val="single" w:color="CCCCCC" w:sz="1"/>
+              <w:right w:val="single" w:color="CCCCCC" w:sz="1"/>
+            </w:tcBorders>
+            <w:shd w:fill="FFFFFF" w:val="clear"/>
+            <w:tcMar>
+              <w:top w:type="dxa" w:w="80"/>
+              <w:left w:type="dxa" w:w="120"/>
+              <w:bottom w:type="dxa" w:w="80"/>
+              <w:right w:type="dxa" w:w="120"/>
+            </w:tcMar>
+          </w:tcPr>
+          <w:p>
+            <w:r>
+              <w:t xml:space="preserve">Python</w:t>
+            </w:r>
+          </w:p>
+        </w:tc>
+        <w:tc>
+          <w:tcPr>
+            <w:tcW w:type="dxa" w:w="2000"/>
+            <w:tcBorders>
+              <w:top w:val="single" w:color="CCCCCC" w:sz="1"/>
+              <w:left w:val="single" w:color="CCCCCC" w:sz="1"/>
+              <w:bottom w:val="single" w:color="CCCCCC" w:sz="1"/>
+              <w:right w:val="single" w:color="CCCCCC" w:sz="1"/>
+            </w:tcBorders>
+            <w:shd w:fill="FFFFFF" w:val="clear"/>
+            <w:tcMar>
+              <w:top w:type="dxa" w:w="80"/>
+              <w:left w:type="dxa" w:w="120"/>
+              <w:bottom w:type="dxa" w:w="80"/>
+              <w:right w:type="dxa" w:w="120"/>
+            </w:tcMar>
+          </w:tcPr>
+          <w:p>
+            <w:r>
+              <w:t xml:space="preserve">3.12+</w:t>
+            </w:r>
+          </w:p>
+        </w:tc>
+        <w:tc>
+          <w:tcPr>
+            <w:tcW w:type="dxa" w:w="4960"/>
+            <w:tcBorders>
+              <w:top w:val="single" w:color="CCCCCC" w:sz="1"/>
+              <w:left w:val="single" w:color="CCCCCC" w:sz="1"/>
+              <w:bottom w:val="single" w:color="CCCCCC" w:sz="1"/>
+              <w:right w:val="single" w:color="CCCCCC" w:sz="1"/>
+            </w:tcBorders>
+            <w:shd w:fill="FFFFFF" w:val="clear"/>
+            <w:tcMar>
+              <w:top w:type="dxa" w:w="80"/>
+              <w:left w:type="dxa" w:w="120"/>
+              <w:bottom w:type="dxa" w:w="80"/>
+              <w:right w:type="dxa" w:w="120"/>
+            </w:tcMar>
+          </w:tcPr>
+          <w:p>
+            <w:r>
+              <w:t xml:space="preserve">venv recommended; all application code</w:t>
+            </w:r>
+          </w:p>
+        </w:tc>
+      </w:tr>
+      <w:tr>
+        <w:tc>
+          <w:tcPr>
+            <w:tcW w:type="dxa" w:w="2400"/>
+            <w:tcBorders>
+              <w:top w:val="single" w:color="CCCCCC" w:sz="1"/>
+              <w:left w:val="single" w:color="CCCCCC" w:sz="1"/>
+              <w:bottom w:val="single" w:color="CCCCCC" w:sz="1"/>
+              <w:right w:val="single" w:color="CCCCCC" w:sz="1"/>
+            </w:tcBorders>
+            <w:shd w:fill="FFFFFF" w:val="clear"/>
+            <w:tcMar>
+              <w:top w:type="dxa" w:w="80"/>
+              <w:left w:type="dxa" w:w="120"/>
+              <w:bottom w:type="dxa" w:w="80"/>
+              <w:right w:type="dxa" w:w="120"/>
+            </w:tcMar>
+          </w:tcPr>
+          <w:p>
+            <w:r>
+              <w:t xml:space="preserve">Docker</w:t>
+            </w:r>
+          </w:p>
+        </w:tc>
+        <w:tc>
+          <w:tcPr>
+            <w:tcW w:type="dxa" w:w="2000"/>
+            <w:tcBorders>
+              <w:top w:val="single" w:color="CCCCCC" w:sz="1"/>
+              <w:left w:val="single" w:color="CCCCCC" w:sz="1"/>
+              <w:bottom w:val="single" w:color="CCCCCC" w:sz="1"/>
+              <w:right w:val="single" w:color="CCCCCC" w:sz="1"/>
+            </w:tcBorders>
+            <w:shd w:fill="FFFFFF" w:val="clear"/>
+            <w:tcMar>
+              <w:top w:type="dxa" w:w="80"/>
+              <w:left w:type="dxa" w:w="120"/>
+              <w:bottom w:type="dxa" w:w="80"/>
+              <w:right w:type="dxa" w:w="120"/>
+            </w:tcMar>
+          </w:tcPr>
+          <w:p>
+            <w:r>
+              <w:t xml:space="preserve">Running daemon</w:t>
+            </w:r>
+          </w:p>
+        </w:tc>
+        <w:tc>
+          <w:tcPr>
+            <w:tcW w:type="dxa" w:w="4960"/>
+            <w:tcBorders>
+              <w:top w:val="single" w:color="CCCCCC" w:sz="1"/>
+              <w:left w:val="single" w:color="CCCCCC" w:sz="1"/>
+              <w:bottom w:val="single" w:color="CCCCCC" w:sz="1"/>
+              <w:right w:val="single" w:color="CCCCCC" w:sz="1"/>
+            </w:tcBorders>
+            <w:shd w:fill="FFFFFF" w:val="clear"/>
+            <w:tcMar>
+              <w:top w:type="dxa" w:w="80"/>
+              <w:left w:type="dxa" w:w="120"/>
+              <w:bottom w:type="dxa" w:w="80"/>
+              <w:right w:type="dxa" w:w="120"/>
+            </w:tcMar>
+          </w:tcPr>
+          <w:p>
+            <w:r>
+              <w:t xml:space="preserve">Neo4j container neo4j-demo on 7474/7687</w:t>
+            </w:r>
+          </w:p>
+        </w:tc>
+      </w:tr>
+      <w:tr>
+        <w:tc>
+          <w:tcPr>
+            <w:tcW w:type="dxa" w:w="2400"/>
+            <w:tcBorders>
+              <w:top w:val="single" w:color="CCCCCC" w:sz="1"/>
+              <w:left w:val="single" w:color="CCCCCC" w:sz="1"/>
+              <w:bottom w:val="single" w:color="CCCCCC" w:sz="1"/>
+              <w:right w:val="single" w:color="CCCCCC" w:sz="1"/>
+            </w:tcBorders>
+            <w:shd w:fill="FFFFFF" w:val="clear"/>
+            <w:tcMar>
+              <w:top w:type="dxa" w:w="80"/>
+              <w:left w:type="dxa" w:w="120"/>
+              <w:bottom w:type="dxa" w:w="80"/>
+              <w:right w:type="dxa" w:w="120"/>
+            </w:tcMar>
+          </w:tcPr>
+          <w:p>
+            <w:r>
+              <w:t xml:space="preserve">Network ports</w:t>
+            </w:r>
+          </w:p>
+        </w:tc>
+        <w:tc>
+          <w:tcPr>
+            <w:tcW w:type="dxa" w:w="2000"/>
+            <w:tcBorders>
+              <w:top w:val="single" w:color="CCCCCC" w:sz="1"/>
+              <w:left w:val="single" w:color="CCCCCC" w:sz="1"/>
+              <w:bottom w:val="single" w:color="CCCCCC" w:sz="1"/>
+              <w:right w:val="single" w:color="CCCCCC" w:sz="1"/>
+            </w:tcBorders>
+            <w:shd w:fill="FFFFFF" w:val="clear"/>
+            <w:tcMar>
+              <w:top w:type="dxa" w:w="80"/>
+              <w:left w:type="dxa" w:w="120"/>
+              <w:bottom w:type="dxa" w:w="80"/>
+              <w:right w:type="dxa" w:w="120"/>
+            </w:tcMar>
+          </w:tcPr>
+          <w:p>
+            <w:r>
+              <w:t xml:space="preserve">7474, 7687, 8080, 8090, 8501 free</w:t>
+            </w:r>
+          </w:p>
+        </w:tc>
+        <w:tc>
+          <w:tcPr>
+            <w:tcW w:type="dxa" w:w="4960"/>
+            <w:tcBorders>
+              <w:top w:val="single" w:color="CCCCCC" w:sz="1"/>
+              <w:left w:val="single" w:color="CCCCCC" w:sz="1"/>
+              <w:bottom w:val="single" w:color="CCCCCC" w:sz="1"/>
+              <w:right w:val="single" w:color="CCCCCC" w:sz="1"/>
+            </w:tcBorders>
+            <w:shd w:fill="FFFFFF" w:val="clear"/>
+            <w:tcMar>
+              <w:top w:type="dxa" w:w="80"/>
+              <w:left w:type="dxa" w:w="120"/>
+              <w:bottom w:type="dxa" w:w="80"/>
+              <w:right w:type="dxa" w:w="120"/>
+            </w:tcMar>
+          </w:tcPr>
+          <w:p>
+            <w:r>
+              <w:t xml:space="preserve">Full enterprise demo binds all five</w:t>
+            </w:r>
+          </w:p>
+        </w:tc>
+      </w:tr>
+      <w:tr>
+        <w:tc>
+          <w:tcPr>
+            <w:tcW w:type="dxa" w:w="2400"/>
+            <w:tcBorders>
+              <w:top w:val="single" w:color="CCCCCC" w:sz="1"/>
+              <w:left w:val="single" w:color="CCCCCC" w:sz="1"/>
+              <w:bottom w:val="single" w:color="CCCCCC" w:sz="1"/>
+              <w:right w:val="single" w:color="CCCCCC" w:sz="1"/>
+            </w:tcBorders>
+            <w:shd w:fill="FFFFFF" w:val="clear"/>
+            <w:tcMar>
+              <w:top w:type="dxa" w:w="80"/>
+              <w:left w:type="dxa" w:w="120"/>
+              <w:bottom w:type="dxa" w:w="80"/>
+              <w:right w:type="dxa" w:w="120"/>
+            </w:tcMar>
+          </w:tcPr>
+          <w:p>
+            <w:r>
+              <w:t xml:space="preserve">Disk space</w:t>
+            </w:r>
+          </w:p>
+        </w:tc>
+        <w:tc>
+          <w:tcPr>
+            <w:tcW w:type="dxa" w:w="2000"/>
+            <w:tcBorders>
+              <w:top w:val="single" w:color="CCCCCC" w:sz="1"/>
+              <w:left w:val="single" w:color="CCCCCC" w:sz="1"/>
+              <w:bottom w:val="single" w:color="CCCCCC" w:sz="1"/>
+              <w:right w:val="single" w:color="CCCCCC" w:sz="1"/>
+            </w:tcBorders>
+            <w:shd w:fill="FFFFFF" w:val="clear"/>
+            <w:tcMar>
+              <w:top w:type="dxa" w:w="80"/>
+              <w:left w:type="dxa" w:w="120"/>
+              <w:bottom w:type="dxa" w:w="80"/>
+              <w:right w:type="dxa" w:w="120"/>
+            </w:tcMar>
+          </w:tcPr>
+          <w:p>
+            <w:r>
+              <w:t xml:space="preserve">~2 GB</w:t>
+            </w:r>
+          </w:p>
+        </w:tc>
+        <w:tc>
+          <w:tcPr>
+            <w:tcW w:type="dxa" w:w="4960"/>
+            <w:tcBorders>
+              <w:top w:val="single" w:color="CCCCCC" w:sz="1"/>
+              <w:left w:val="single" w:color="CCCCCC" w:sz="1"/>
+              <w:bottom w:val="single" w:color="CCCCCC" w:sz="1"/>
+              <w:right w:val="single" w:color="CCCCCC" w:sz="1"/>
+            </w:tcBorders>
+            <w:shd w:fill="FFFFFF" w:val="clear"/>
+            <w:tcMar>
+              <w:top w:type="dxa" w:w="80"/>
+              <w:left w:type="dxa" w:w="120"/>
+              <w:bottom w:type="dxa" w:w="80"/>
+              <w:right w:type="dxa" w:w="120"/>
+            </w:tcMar>
+          </w:tcPr>
+          <w:p>
+            <w:r>
+              <w:t xml:space="preserve">Neo4j image, venv, generated catalog/lineage</w:t>
+            </w:r>
+          </w:p>
+        </w:tc>
+      </w:tr>
+      <w:tr>
+        <w:tc>
+          <w:tcPr>
+            <w:tcW w:type="dxa" w:w="2400"/>
+            <w:tcBorders>
+              <w:top w:val="single" w:color="CCCCCC" w:sz="1"/>
+              <w:left w:val="single" w:color="CCCCCC" w:sz="1"/>
+              <w:bottom w:val="single" w:color="CCCCCC" w:sz="1"/>
+              <w:right w:val="single" w:color="CCCCCC" w:sz="1"/>
+            </w:tcBorders>
+            <w:shd w:fill="FFFFFF" w:val="clear"/>
+            <w:tcMar>
+              <w:top w:type="dxa" w:w="80"/>
+              <w:left w:type="dxa" w:w="120"/>
+              <w:bottom w:type="dxa" w:w="80"/>
+              <w:right w:type="dxa" w:w="120"/>
+            </w:tcMar>
+          </w:tcPr>
+          <w:p>
+            <w:r>
+              <w:t xml:space="preserve">LLM API key</w:t>
+            </w:r>
+          </w:p>
+        </w:tc>
+        <w:tc>
+          <w:tcPr>
+            <w:tcW w:type="dxa" w:w="2000"/>
+            <w:tcBorders>
+              <w:top w:val="single" w:color="CCCCCC" w:sz="1"/>
+              <w:left w:val="single" w:color="CCCCCC" w:sz="1"/>
+              <w:bottom w:val="single" w:color="CCCCCC" w:sz="1"/>
+              <w:right w:val="single" w:color="CCCCCC" w:sz="1"/>
+            </w:tcBorders>
+            <w:shd w:fill="FFFFFF" w:val="clear"/>
+            <w:tcMar>
+              <w:top w:type="dxa" w:w="80"/>
+              <w:left w:type="dxa" w:w="120"/>
+              <w:bottom w:type="dxa" w:w="80"/>
+              <w:right w:type="dxa" w:w="120"/>
+            </w:tcMar>
+          </w:tcPr>
+          <w:p>
+            <w:r>
+              <w:t xml:space="preserve">Not required</w:t>
+            </w:r>
+          </w:p>
+        </w:tc>
+        <w:tc>
+          <w:tcPr>
+            <w:tcW w:type="dxa" w:w="4960"/>
+            <w:tcBorders>
+              <w:top w:val="single" w:color="CCCCCC" w:sz="1"/>
+              <w:left w:val="single" w:color="CCCCCC" w:sz="1"/>
+              <w:bottom w:val="single" w:color="CCCCCC" w:sz="1"/>
+              <w:right w:val="single" w:color="CCCCCC" w:sz="1"/>
+            </w:tcBorders>
+            <w:shd w:fill="FFFFFF" w:val="clear"/>
+            <w:tcMar>
+              <w:top w:type="dxa" w:w="80"/>
+              <w:left w:type="dxa" w:w="120"/>
+              <w:bottom w:type="dxa" w:w="80"/>
+              <w:right w:type="dxa" w:w="120"/>
+            </w:tcMar>
+          </w:tcPr>
+          <w:p>
+            <w:r>
+              <w:t xml:space="preserve">Graph-native demo mode is default</w:t>
+            </w:r>
+          </w:p>
+        </w:tc>
+      </w:tr>
+      <w:tr>
+        <w:tc>
+          <w:tcPr>
+            <w:tcW w:type="dxa" w:w="2400"/>
+            <w:tcBorders>
+              <w:top w:val="single" w:color="CCCCCC" w:sz="1"/>
+              <w:left w:val="single" w:color="CCCCCC" w:sz="1"/>
+              <w:bottom w:val="single" w:color="CCCCCC" w:sz="1"/>
+              <w:right w:val="single" w:color="CCCCCC" w:sz="1"/>
+            </w:tcBorders>
+            <w:shd w:fill="FFFFFF" w:val="clear"/>
+            <w:tcMar>
+              <w:top w:type="dxa" w:w="80"/>
+              <w:left w:type="dxa" w:w="120"/>
+              <w:bottom w:type="dxa" w:w="80"/>
+              <w:right w:type="dxa" w:w="120"/>
+            </w:tcMar>
+          </w:tcPr>
+          <w:p>
+            <w:r>
+              <w:t xml:space="preserve">Node.js</w:t>
+            </w:r>
+          </w:p>
+        </w:tc>
+        <w:tc>
+          <w:tcPr>
+            <w:tcW w:type="dxa" w:w="2000"/>
+            <w:tcBorders>
+              <w:top w:val="single" w:color="CCCCCC" w:sz="1"/>
+              <w:left w:val="single" w:color="CCCCCC" w:sz="1"/>
+              <w:bottom w:val="single" w:color="CCCCCC" w:sz="1"/>
+              <w:right w:val="single" w:color="CCCCCC" w:sz="1"/>
+            </w:tcBorders>
+            <w:shd w:fill="FFFFFF" w:val="clear"/>
+            <w:tcMar>
+              <w:top w:type="dxa" w:w="80"/>
+              <w:left w:type="dxa" w:w="120"/>
+              <w:bottom w:type="dxa" w:w="80"/>
+              <w:right w:type="dxa" w:w="120"/>
+            </w:tcMar>
+          </w:tcPr>
+          <w:p>
+            <w:r>
+              <w:t xml:space="preserve">18+ (optional)</w:t>
+            </w:r>
+          </w:p>
+        </w:tc>
+        <w:tc>
+          <w:tcPr>
+            <w:tcW w:type="dxa" w:w="4960"/>
+            <w:tcBorders>
+              <w:top w:val="single" w:color="CCCCCC" w:sz="1"/>
+              <w:left w:val="single" w:color="CCCCCC" w:sz="1"/>
+              <w:bottom w:val="single" w:color="CCCCCC" w:sz="1"/>
+              <w:right w:val="single" w:color="CCCCCC" w:sz="1"/>
+            </w:tcBorders>
+            <w:shd w:fill="FFFFFF" w:val="clear"/>
+            <w:tcMar>
+              <w:top w:type="dxa" w:w="80"/>
+              <w:left w:type="dxa" w:w="120"/>
+              <w:bottom w:type="dxa" w:w="80"/>
+              <w:right w:type="dxa" w:w="120"/>
+            </w:tcMar>
+          </w:tcPr>
+          <w:p>
+            <w:r>
+              <w:t xml:space="preserve">Only for regenerating Word docs in docs/</w:t>
+            </w:r>
+          </w:p>
+        </w:tc>
+      </w:tr>
+    </w:tbl>
+    <w:p>
+      <w:pPr>
+        <w:spacing w:after="200"/>
+      </w:pPr>
+    </w:p>
+    <w:p>
+      <w:pPr>
+        <w:spacing w:after="120"/>
+      </w:pPr>
+      <w:r>
+        <w:t xml:space="preserve">First-time setup:</w:t>
+      </w:r>
+    </w:p>
+    <w:p>
+      <w:pPr>
+        <w:shd w:fill="F2F2F2" w:val="clear"/>
+        <w:spacing w:after="80" w:before="80"/>
+      </w:pPr>
+      <w:r>
+        <w:rPr>
+          <w:rFonts w:ascii="Courier New" w:cs="Courier New" w:eastAsia="Courier New" w:hAnsi="Courier New"/>
+          <w:sz w:val="20"/>
+          <w:szCs w:val="20"/>
+        </w:rPr>
+        <w:t xml:space="preserve">python -m venv venv &amp;&amp; source venv/bin/activate
+pip install -r requirements.txt
+cp .env.example .env</w:t>
+      </w:r>
+    </w:p>
+    <w:p>
+      <w:pPr>
+        <w:pStyle w:val="Heading2"/>
+      </w:pPr>
+      <w:r>
+        <w:t xml:space="preserve">10.2 Dependencies</w:t>
+      </w:r>
+    </w:p>
+    <w:tbl>
+      <w:tblPr>
+        <w:tblW w:type="dxa" w:w="9360"/>
+        <w:tblBorders>
+          <w:top w:val="single" w:color="auto" w:sz="4"/>
+          <w:left w:val="single" w:color="auto" w:sz="4"/>
+          <w:bottom w:val="single" w:color="auto" w:sz="4"/>
+          <w:right w:val="single" w:color="auto" w:sz="4"/>
+          <w:insideH w:val="single" w:color="auto" w:sz="4"/>
+          <w:insideV w:val="single" w:color="auto" w:sz="4"/>
+        </w:tblBorders>
+      </w:tblPr>
+      <w:tblGrid>
+        <w:gridCol w:w="1600"/>
+        <w:gridCol w:w="2800"/>
+        <w:gridCol w:w="3600"/>
+        <w:gridCol w:w="1360"/>
+      </w:tblGrid>
+      <w:tr>
+        <w:tc>
+          <w:tcPr>
+            <w:tcW w:type="dxa" w:w="1600"/>
+            <w:tcBorders>
+              <w:top w:val="single" w:color="CCCCCC" w:sz="1"/>
+              <w:left w:val="single" w:color="CCCCCC" w:sz="1"/>
+              <w:bottom w:val="single" w:color="CCCCCC" w:sz="1"/>
+              <w:right w:val="single" w:color="CCCCCC" w:sz="1"/>
+            </w:tcBorders>
+            <w:shd w:fill="2E75B6" w:val="clear"/>
+            <w:tcMar>
+              <w:top w:type="dxa" w:w="80"/>
+              <w:left w:type="dxa" w:w="120"/>
+              <w:bottom w:type="dxa" w:w="80"/>
+              <w:right w:type="dxa" w:w="120"/>
+            </w:tcMar>
+          </w:tcPr>
+          <w:p>
+            <w:r>
+              <w:rPr>
+                <w:b/>
+                <w:bCs/>
+                <w:color w:val="FFFFFF"/>
+              </w:rPr>
+              <w:t xml:space="preserve">Category</w:t>
+            </w:r>
+          </w:p>
+        </w:tc>
+        <w:tc>
+          <w:tcPr>
+            <w:tcW w:type="dxa" w:w="2800"/>
+            <w:tcBorders>
+              <w:top w:val="single" w:color="CCCCCC" w:sz="1"/>
+              <w:left w:val="single" w:color="CCCCCC" w:sz="1"/>
+              <w:bottom w:val="single" w:color="CCCCCC" w:sz="1"/>
+              <w:right w:val="single" w:color="CCCCCC" w:sz="1"/>
+            </w:tcBorders>
+            <w:shd w:fill="2E75B6" w:val="clear"/>
+            <w:tcMar>
+              <w:top w:type="dxa" w:w="80"/>
+              <w:left w:type="dxa" w:w="120"/>
+              <w:bottom w:type="dxa" w:w="80"/>
+              <w:right w:type="dxa" w:w="120"/>
+            </w:tcMar>
+          </w:tcPr>
+          <w:p>
+            <w:r>
+              <w:rPr>
+                <w:b/>
+                <w:bCs/>
+                <w:color w:val="FFFFFF"/>
+              </w:rPr>
+              <w:t xml:space="preserve">Component</w:t>
+            </w:r>
+          </w:p>
+        </w:tc>
+        <w:tc>
+          <w:tcPr>
+            <w:tcW w:type="dxa" w:w="3600"/>
+            <w:tcBorders>
+              <w:top w:val="single" w:color="CCCCCC" w:sz="1"/>
+              <w:left w:val="single" w:color="CCCCCC" w:sz="1"/>
+              <w:bottom w:val="single" w:color="CCCCCC" w:sz="1"/>
+              <w:right w:val="single" w:color="CCCCCC" w:sz="1"/>
+            </w:tcBorders>
+            <w:shd w:fill="2E75B6" w:val="clear"/>
+            <w:tcMar>
+              <w:top w:type="dxa" w:w="80"/>
+              <w:left w:type="dxa" w:w="120"/>
+              <w:bottom w:type="dxa" w:w="80"/>
+              <w:right w:type="dxa" w:w="120"/>
+            </w:tcMar>
+          </w:tcPr>
+          <w:p>
+            <w:r>
+              <w:rPr>
+                <w:b/>
+                <w:bCs/>
+                <w:color w:val="FFFFFF"/>
+              </w:rPr>
+              <w:t xml:space="preserve">Role</w:t>
+            </w:r>
+          </w:p>
+        </w:tc>
+        <w:tc>
+          <w:tcPr>
+            <w:tcW w:type="dxa" w:w="1360"/>
+            <w:tcBorders>
+              <w:top w:val="single" w:color="CCCCCC" w:sz="1"/>
+              <w:left w:val="single" w:color="CCCCCC" w:sz="1"/>
+              <w:bottom w:val="single" w:color="CCCCCC" w:sz="1"/>
+              <w:right w:val="single" w:color="CCCCCC" w:sz="1"/>
+            </w:tcBorders>
+            <w:shd w:fill="2E75B6" w:val="clear"/>
+            <w:tcMar>
+              <w:top w:type="dxa" w:w="80"/>
+              <w:left w:type="dxa" w:w="120"/>
+              <w:bottom w:type="dxa" w:w="80"/>
+              <w:right w:type="dxa" w:w="120"/>
+            </w:tcMar>
+          </w:tcPr>
+          <w:p>
+            <w:r>
+              <w:rPr>
+                <w:b/>
+                <w:bCs/>
+                <w:color w:val="FFFFFF"/>
+              </w:rPr>
+              <w:t xml:space="preserve">Required?</w:t>
+            </w:r>
+          </w:p>
+        </w:tc>
+      </w:tr>
+      <w:tr>
+        <w:tc>
+          <w:tcPr>
+            <w:tcW w:type="dxa" w:w="1600"/>
+            <w:tcBorders>
+              <w:top w:val="single" w:color="CCCCCC" w:sz="1"/>
+              <w:left w:val="single" w:color="CCCCCC" w:sz="1"/>
+              <w:bottom w:val="single" w:color="CCCCCC" w:sz="1"/>
+              <w:right w:val="single" w:color="CCCCCC" w:sz="1"/>
+            </w:tcBorders>
+            <w:shd w:fill="FFFFFF" w:val="clear"/>
+            <w:tcMar>
+              <w:top w:type="dxa" w:w="80"/>
+              <w:left w:type="dxa" w:w="120"/>
+              <w:bottom w:type="dxa" w:w="80"/>
+              <w:right w:type="dxa" w:w="120"/>
+            </w:tcMar>
+          </w:tcPr>
+          <w:p>
+            <w:r>
+              <w:t xml:space="preserve">Runtime</w:t>
+            </w:r>
+          </w:p>
+        </w:tc>
+        <w:tc>
+          <w:tcPr>
+            <w:tcW w:type="dxa" w:w="2800"/>
+            <w:tcBorders>
+              <w:top w:val="single" w:color="CCCCCC" w:sz="1"/>
+              <w:left w:val="single" w:color="CCCCCC" w:sz="1"/>
+              <w:bottom w:val="single" w:color="CCCCCC" w:sz="1"/>
+              <w:right w:val="single" w:color="CCCCCC" w:sz="1"/>
+            </w:tcBorders>
+            <w:shd w:fill="FFFFFF" w:val="clear"/>
+            <w:tcMar>
+              <w:top w:type="dxa" w:w="80"/>
+              <w:left w:type="dxa" w:w="120"/>
+              <w:bottom w:type="dxa" w:w="80"/>
+              <w:right w:type="dxa" w:w="120"/>
+            </w:tcMar>
+          </w:tcPr>
+          <w:p>
+            <w:r>
+              <w:t xml:space="preserve">Neo4j 5.x + neo4j Python driver</w:t>
+            </w:r>
+          </w:p>
+        </w:tc>
+        <w:tc>
+          <w:tcPr>
+            <w:tcW w:type="dxa" w:w="3600"/>
+            <w:tcBorders>
+              <w:top w:val="single" w:color="CCCCCC" w:sz="1"/>
+              <w:left w:val="single" w:color="CCCCCC" w:sz="1"/>
+              <w:bottom w:val="single" w:color="CCCCCC" w:sz="1"/>
+              <w:right w:val="single" w:color="CCCCCC" w:sz="1"/>
+            </w:tcBorders>
+            <w:shd w:fill="FFFFFF" w:val="clear"/>
+            <w:tcMar>
+              <w:top w:type="dxa" w:w="80"/>
+              <w:left w:type="dxa" w:w="120"/>
+              <w:bottom w:type="dxa" w:w="80"/>
+              <w:right w:type="dxa" w:w="120"/>
+            </w:tcMar>
+          </w:tcPr>
+          <w:p>
+            <w:r>
+              <w:t xml:space="preserve">Knowledge graph storage and Cypher queries</w:t>
+            </w:r>
+          </w:p>
+        </w:tc>
+        <w:tc>
+          <w:tcPr>
+            <w:tcW w:type="dxa" w:w="1360"/>
+            <w:tcBorders>
+              <w:top w:val="single" w:color="CCCCCC" w:sz="1"/>
+              <w:left w:val="single" w:color="CCCCCC" w:sz="1"/>
+              <w:bottom w:val="single" w:color="CCCCCC" w:sz="1"/>
+              <w:right w:val="single" w:color="CCCCCC" w:sz="1"/>
+            </w:tcBorders>
+            <w:shd w:fill="FFFFFF" w:val="clear"/>
+            <w:tcMar>
+              <w:top w:type="dxa" w:w="80"/>
+              <w:left w:type="dxa" w:w="120"/>
+              <w:bottom w:type="dxa" w:w="80"/>
+              <w:right w:type="dxa" w:w="120"/>
+            </w:tcMar>
+          </w:tcPr>
+          <w:p>
+            <w:r>
+              <w:t xml:space="preserve">Yes</w:t>
+            </w:r>
+          </w:p>
+        </w:tc>
+      </w:tr>
+      <w:tr>
+        <w:tc>
+          <w:tcPr>
+            <w:tcW w:type="dxa" w:w="1600"/>
+            <w:tcBorders>
+              <w:top w:val="single" w:color="CCCCCC" w:sz="1"/>
+              <w:left w:val="single" w:color="CCCCCC" w:sz="1"/>
+              <w:bottom w:val="single" w:color="CCCCCC" w:sz="1"/>
+              <w:right w:val="single" w:color="CCCCCC" w:sz="1"/>
+            </w:tcBorders>
+            <w:shd w:fill="FFFFFF" w:val="clear"/>
+            <w:tcMar>
+              <w:top w:type="dxa" w:w="80"/>
+              <w:left w:type="dxa" w:w="120"/>
+              <w:bottom w:type="dxa" w:w="80"/>
+              <w:right w:type="dxa" w:w="120"/>
+            </w:tcMar>
+          </w:tcPr>
+          <w:p>
+            <w:r>
+              <w:t xml:space="preserve">Runtime</w:t>
+            </w:r>
+          </w:p>
+        </w:tc>
+        <w:tc>
+          <w:tcPr>
+            <w:tcW w:type="dxa" w:w="2800"/>
+            <w:tcBorders>
+              <w:top w:val="single" w:color="CCCCCC" w:sz="1"/>
+              <w:left w:val="single" w:color="CCCCCC" w:sz="1"/>
+              <w:bottom w:val="single" w:color="CCCCCC" w:sz="1"/>
+              <w:right w:val="single" w:color="CCCCCC" w:sz="1"/>
+            </w:tcBorders>
+            <w:shd w:fill="FFFFFF" w:val="clear"/>
+            <w:tcMar>
+              <w:top w:type="dxa" w:w="80"/>
+              <w:left w:type="dxa" w:w="120"/>
+              <w:bottom w:type="dxa" w:w="80"/>
+              <w:right w:type="dxa" w:w="120"/>
+            </w:tcMar>
+          </w:tcPr>
+          <w:p>
+            <w:r>
+              <w:t xml:space="preserve">LangGraph + LangChain</w:t>
+            </w:r>
+          </w:p>
+        </w:tc>
+        <w:tc>
+          <w:tcPr>
+            <w:tcW w:type="dxa" w:w="3600"/>
+            <w:tcBorders>
+              <w:top w:val="single" w:color="CCCCCC" w:sz="1"/>
+              <w:left w:val="single" w:color="CCCCCC" w:sz="1"/>
+              <w:bottom w:val="single" w:color="CCCCCC" w:sz="1"/>
+              <w:right w:val="single" w:color="CCCCCC" w:sz="1"/>
+            </w:tcBorders>
+            <w:shd w:fill="FFFFFF" w:val="clear"/>
+            <w:tcMar>
+              <w:top w:type="dxa" w:w="80"/>
+              <w:left w:type="dxa" w:w="120"/>
+              <w:bottom w:type="dxa" w:w="80"/>
+              <w:right w:type="dxa" w:w="120"/>
+            </w:tcMar>
+          </w:tcPr>
+          <w:p>
+            <w:r>
+              <w:t xml:space="preserve">Agent workflow (detect → diagnose → format → escalate)</w:t>
+            </w:r>
+          </w:p>
+        </w:tc>
+        <w:tc>
+          <w:tcPr>
+            <w:tcW w:type="dxa" w:w="1360"/>
+            <w:tcBorders>
+              <w:top w:val="single" w:color="CCCCCC" w:sz="1"/>
+              <w:left w:val="single" w:color="CCCCCC" w:sz="1"/>
+              <w:bottom w:val="single" w:color="CCCCCC" w:sz="1"/>
+              <w:right w:val="single" w:color="CCCCCC" w:sz="1"/>
+            </w:tcBorders>
+            <w:shd w:fill="FFFFFF" w:val="clear"/>
+            <w:tcMar>
+              <w:top w:type="dxa" w:w="80"/>
+              <w:left w:type="dxa" w:w="120"/>
+              <w:bottom w:type="dxa" w:w="80"/>
+              <w:right w:type="dxa" w:w="120"/>
+            </w:tcMar>
+          </w:tcPr>
+          <w:p>
+            <w:r>
+              <w:t xml:space="preserve">Yes</w:t>
+            </w:r>
+          </w:p>
+        </w:tc>
+      </w:tr>
+      <w:tr>
+        <w:tc>
+          <w:tcPr>
+            <w:tcW w:type="dxa" w:w="1600"/>
+            <w:tcBorders>
+              <w:top w:val="single" w:color="CCCCCC" w:sz="1"/>
+              <w:left w:val="single" w:color="CCCCCC" w:sz="1"/>
+              <w:bottom w:val="single" w:color="CCCCCC" w:sz="1"/>
+              <w:right w:val="single" w:color="CCCCCC" w:sz="1"/>
+            </w:tcBorders>
+            <w:shd w:fill="FFFFFF" w:val="clear"/>
+            <w:tcMar>
+              <w:top w:type="dxa" w:w="80"/>
+              <w:left w:type="dxa" w:w="120"/>
+              <w:bottom w:type="dxa" w:w="80"/>
+              <w:right w:type="dxa" w:w="120"/>
+            </w:tcMar>
+          </w:tcPr>
+          <w:p>
+            <w:r>
+              <w:t xml:space="preserve">Runtime</w:t>
+            </w:r>
+          </w:p>
+        </w:tc>
+        <w:tc>
+          <w:tcPr>
+            <w:tcW w:type="dxa" w:w="2800"/>
+            <w:tcBorders>
+              <w:top w:val="single" w:color="CCCCCC" w:sz="1"/>
+              <w:left w:val="single" w:color="CCCCCC" w:sz="1"/>
+              <w:bottom w:val="single" w:color="CCCCCC" w:sz="1"/>
+              <w:right w:val="single" w:color="CCCCCC" w:sz="1"/>
+            </w:tcBorders>
+            <w:shd w:fill="FFFFFF" w:val="clear"/>
+            <w:tcMar>
+              <w:top w:type="dxa" w:w="80"/>
+              <w:left w:type="dxa" w:w="120"/>
+              <w:bottom w:type="dxa" w:w="80"/>
+              <w:right w:type="dxa" w:w="120"/>
+            </w:tcMar>
+          </w:tcPr>
+          <w:p>
+            <w:r>
+              <w:t xml:space="preserve">Pydantic / pydantic-settings</w:t>
+            </w:r>
+          </w:p>
+        </w:tc>
+        <w:tc>
+          <w:tcPr>
+            <w:tcW w:type="dxa" w:w="3600"/>
+            <w:tcBorders>
+              <w:top w:val="single" w:color="CCCCCC" w:sz="1"/>
+              <w:left w:val="single" w:color="CCCCCC" w:sz="1"/>
+              <w:bottom w:val="single" w:color="CCCCCC" w:sz="1"/>
+              <w:right w:val="single" w:color="CCCCCC" w:sz="1"/>
+            </w:tcBorders>
+            <w:shd w:fill="FFFFFF" w:val="clear"/>
+            <w:tcMar>
+              <w:top w:type="dxa" w:w="80"/>
+              <w:left w:type="dxa" w:w="120"/>
+              <w:bottom w:type="dxa" w:w="80"/>
+              <w:right w:type="dxa" w:w="120"/>
+            </w:tcMar>
+          </w:tcPr>
+          <w:p>
+            <w:r>
+              <w:t xml:space="preserve">Ontology validation and environment config</w:t>
+            </w:r>
+          </w:p>
+        </w:tc>
+        <w:tc>
+          <w:tcPr>
+            <w:tcW w:type="dxa" w:w="1360"/>
+            <w:tcBorders>
+              <w:top w:val="single" w:color="CCCCCC" w:sz="1"/>
+              <w:left w:val="single" w:color="CCCCCC" w:sz="1"/>
+              <w:bottom w:val="single" w:color="CCCCCC" w:sz="1"/>
+              <w:right w:val="single" w:color="CCCCCC" w:sz="1"/>
+            </w:tcBorders>
+            <w:shd w:fill="FFFFFF" w:val="clear"/>
+            <w:tcMar>
+              <w:top w:type="dxa" w:w="80"/>
+              <w:left w:type="dxa" w:w="120"/>
+              <w:bottom w:type="dxa" w:w="80"/>
+              <w:right w:type="dxa" w:w="120"/>
+            </w:tcMar>
+          </w:tcPr>
+          <w:p>
+            <w:r>
+              <w:t xml:space="preserve">Yes</w:t>
+            </w:r>
+          </w:p>
+        </w:tc>
+      </w:tr>
+      <w:tr>
+        <w:tc>
+          <w:tcPr>
+            <w:tcW w:type="dxa" w:w="1600"/>
+            <w:tcBorders>
+              <w:top w:val="single" w:color="CCCCCC" w:sz="1"/>
+              <w:left w:val="single" w:color="CCCCCC" w:sz="1"/>
+              <w:bottom w:val="single" w:color="CCCCCC" w:sz="1"/>
+              <w:right w:val="single" w:color="CCCCCC" w:sz="1"/>
+            </w:tcBorders>
+            <w:shd w:fill="FFFFFF" w:val="clear"/>
+            <w:tcMar>
+              <w:top w:type="dxa" w:w="80"/>
+              <w:left w:type="dxa" w:w="120"/>
+              <w:bottom w:type="dxa" w:w="80"/>
+              <w:right w:type="dxa" w:w="120"/>
+            </w:tcMar>
+          </w:tcPr>
+          <w:p>
+            <w:r>
+              <w:t xml:space="preserve">Runtime</w:t>
+            </w:r>
+          </w:p>
+        </w:tc>
+        <w:tc>
+          <w:tcPr>
+            <w:tcW w:type="dxa" w:w="2800"/>
+            <w:tcBorders>
+              <w:top w:val="single" w:color="CCCCCC" w:sz="1"/>
+              <w:left w:val="single" w:color="CCCCCC" w:sz="1"/>
+              <w:bottom w:val="single" w:color="CCCCCC" w:sz="1"/>
+              <w:right w:val="single" w:color="CCCCCC" w:sz="1"/>
+            </w:tcBorders>
+            <w:shd w:fill="FFFFFF" w:val="clear"/>
+            <w:tcMar>
+              <w:top w:type="dxa" w:w="80"/>
+              <w:left w:type="dxa" w:w="120"/>
+              <w:bottom w:type="dxa" w:w="80"/>
+              <w:right w:type="dxa" w:w="120"/>
+            </w:tcMar>
+          </w:tcPr>
+          <w:p>
+            <w:r>
+              <w:t xml:space="preserve">FastAPI + uvicorn</w:t>
+            </w:r>
+          </w:p>
+        </w:tc>
+        <w:tc>
+          <w:tcPr>
+            <w:tcW w:type="dxa" w:w="3600"/>
+            <w:tcBorders>
+              <w:top w:val="single" w:color="CCCCCC" w:sz="1"/>
+              <w:left w:val="single" w:color="CCCCCC" w:sz="1"/>
+              <w:bottom w:val="single" w:color="CCCCCC" w:sz="1"/>
+              <w:right w:val="single" w:color="CCCCCC" w:sz="1"/>
+            </w:tcBorders>
+            <w:shd w:fill="FFFFFF" w:val="clear"/>
+            <w:tcMar>
+              <w:top w:type="dxa" w:w="80"/>
+              <w:left w:type="dxa" w:w="120"/>
+              <w:bottom w:type="dxa" w:w="80"/>
+              <w:right w:type="dxa" w:w="120"/>
+            </w:tcMar>
+          </w:tcPr>
+          <w:p>
+            <w:r>
+              <w:t xml:space="preserve">Diagnostics REST API (:8080)</w:t>
+            </w:r>
+          </w:p>
+        </w:tc>
+        <w:tc>
+          <w:tcPr>
+            <w:tcW w:type="dxa" w:w="1360"/>
+            <w:tcBorders>
+              <w:top w:val="single" w:color="CCCCCC" w:sz="1"/>
+              <w:left w:val="single" w:color="CCCCCC" w:sz="1"/>
+              <w:bottom w:val="single" w:color="CCCCCC" w:sz="1"/>
+              <w:right w:val="single" w:color="CCCCCC" w:sz="1"/>
+            </w:tcBorders>
+            <w:shd w:fill="FFFFFF" w:val="clear"/>
+            <w:tcMar>
+              <w:top w:type="dxa" w:w="80"/>
+              <w:left w:type="dxa" w:w="120"/>
+              <w:bottom w:type="dxa" w:w="80"/>
+              <w:right w:type="dxa" w:w="120"/>
+            </w:tcMar>
+          </w:tcPr>
+          <w:p>
+            <w:r>
+              <w:t xml:space="preserve">Enterprise demo</w:t>
+            </w:r>
+          </w:p>
+        </w:tc>
+      </w:tr>
+      <w:tr>
+        <w:tc>
+          <w:tcPr>
+            <w:tcW w:type="dxa" w:w="1600"/>
+            <w:tcBorders>
+              <w:top w:val="single" w:color="CCCCCC" w:sz="1"/>
+              <w:left w:val="single" w:color="CCCCCC" w:sz="1"/>
+              <w:bottom w:val="single" w:color="CCCCCC" w:sz="1"/>
+              <w:right w:val="single" w:color="CCCCCC" w:sz="1"/>
+            </w:tcBorders>
+            <w:shd w:fill="FFFFFF" w:val="clear"/>
+            <w:tcMar>
+              <w:top w:type="dxa" w:w="80"/>
+              <w:left w:type="dxa" w:w="120"/>
+              <w:bottom w:type="dxa" w:w="80"/>
+              <w:right w:type="dxa" w:w="120"/>
+            </w:tcMar>
+          </w:tcPr>
+          <w:p>
+            <w:r>
+              <w:t xml:space="preserve">Runtime</w:t>
+            </w:r>
+          </w:p>
+        </w:tc>
+        <w:tc>
+          <w:tcPr>
+            <w:tcW w:type="dxa" w:w="2800"/>
+            <w:tcBorders>
+              <w:top w:val="single" w:color="CCCCCC" w:sz="1"/>
+              <w:left w:val="single" w:color="CCCCCC" w:sz="1"/>
+              <w:bottom w:val="single" w:color="CCCCCC" w:sz="1"/>
+              <w:right w:val="single" w:color="CCCCCC" w:sz="1"/>
+            </w:tcBorders>
+            <w:shd w:fill="FFFFFF" w:val="clear"/>
+            <w:tcMar>
+              <w:top w:type="dxa" w:w="80"/>
+              <w:left w:type="dxa" w:w="120"/>
+              <w:bottom w:type="dxa" w:w="80"/>
+              <w:right w:type="dxa" w:w="120"/>
+            </w:tcMar>
+          </w:tcPr>
+          <w:p>
+            <w:r>
+              <w:t xml:space="preserve">Streamlit</w:t>
+            </w:r>
+          </w:p>
+        </w:tc>
+        <w:tc>
+          <w:tcPr>
+            <w:tcW w:type="dxa" w:w="3600"/>
+            <w:tcBorders>
+              <w:top w:val="single" w:color="CCCCCC" w:sz="1"/>
+              <w:left w:val="single" w:color="CCCCCC" w:sz="1"/>
+              <w:bottom w:val="single" w:color="CCCCCC" w:sz="1"/>
+              <w:right w:val="single" w:color="CCCCCC" w:sz="1"/>
+            </w:tcBorders>
+            <w:shd w:fill="FFFFFF" w:val="clear"/>
+            <w:tcMar>
+              <w:top w:type="dxa" w:w="80"/>
+              <w:left w:type="dxa" w:w="120"/>
+              <w:bottom w:type="dxa" w:w="80"/>
+              <w:right w:type="dxa" w:w="120"/>
+            </w:tcMar>
+          </w:tcPr>
+          <w:p>
+            <w:r>
+              <w:t xml:space="preserve">Customer chat, agent dashboard, KG explorer</w:t>
+            </w:r>
+          </w:p>
+        </w:tc>
+        <w:tc>
+          <w:tcPr>
+            <w:tcW w:type="dxa" w:w="1360"/>
+            <w:tcBorders>
+              <w:top w:val="single" w:color="CCCCCC" w:sz="1"/>
+              <w:left w:val="single" w:color="CCCCCC" w:sz="1"/>
+              <w:bottom w:val="single" w:color="CCCCCC" w:sz="1"/>
+              <w:right w:val="single" w:color="CCCCCC" w:sz="1"/>
+            </w:tcBorders>
+            <w:shd w:fill="FFFFFF" w:val="clear"/>
+            <w:tcMar>
+              <w:top w:type="dxa" w:w="80"/>
+              <w:left w:type="dxa" w:w="120"/>
+              <w:bottom w:type="dxa" w:w="80"/>
+              <w:right w:type="dxa" w:w="120"/>
+            </w:tcMar>
+          </w:tcPr>
+          <w:p>
+            <w:r>
+              <w:t xml:space="preserve">Demo UI</w:t>
+            </w:r>
+          </w:p>
+        </w:tc>
+      </w:tr>
+      <w:tr>
+        <w:tc>
+          <w:tcPr>
+            <w:tcW w:type="dxa" w:w="1600"/>
+            <w:tcBorders>
+              <w:top w:val="single" w:color="CCCCCC" w:sz="1"/>
+              <w:left w:val="single" w:color="CCCCCC" w:sz="1"/>
+              <w:bottom w:val="single" w:color="CCCCCC" w:sz="1"/>
+              <w:right w:val="single" w:color="CCCCCC" w:sz="1"/>
+            </w:tcBorders>
+            <w:shd w:fill="FFFFFF" w:val="clear"/>
+            <w:tcMar>
+              <w:top w:type="dxa" w:w="80"/>
+              <w:left w:type="dxa" w:w="120"/>
+              <w:bottom w:type="dxa" w:w="80"/>
+              <w:right w:type="dxa" w:w="120"/>
+            </w:tcMar>
+          </w:tcPr>
+          <w:p>
+            <w:r>
+              <w:t xml:space="preserve">Runtime</w:t>
+            </w:r>
+          </w:p>
+        </w:tc>
+        <w:tc>
+          <w:tcPr>
+            <w:tcW w:type="dxa" w:w="2800"/>
+            <w:tcBorders>
+              <w:top w:val="single" w:color="CCCCCC" w:sz="1"/>
+              <w:left w:val="single" w:color="CCCCCC" w:sz="1"/>
+              <w:bottom w:val="single" w:color="CCCCCC" w:sz="1"/>
+              <w:right w:val="single" w:color="CCCCCC" w:sz="1"/>
+            </w:tcBorders>
+            <w:shd w:fill="FFFFFF" w:val="clear"/>
+            <w:tcMar>
+              <w:top w:type="dxa" w:w="80"/>
+              <w:left w:type="dxa" w:w="120"/>
+              <w:bottom w:type="dxa" w:w="80"/>
+              <w:right w:type="dxa" w:w="120"/>
+            </w:tcMar>
+          </w:tcPr>
+          <w:p>
+            <w:r>
+              <w:t xml:space="preserve">httpx</w:t>
+            </w:r>
+          </w:p>
+        </w:tc>
+        <w:tc>
+          <w:tcPr>
+            <w:tcW w:type="dxa" w:w="3600"/>
+            <w:tcBorders>
+              <w:top w:val="single" w:color="CCCCCC" w:sz="1"/>
+              <w:left w:val="single" w:color="CCCCCC" w:sz="1"/>
+              <w:bottom w:val="single" w:color="CCCCCC" w:sz="1"/>
+              <w:right w:val="single" w:color="CCCCCC" w:sz="1"/>
+            </w:tcBorders>
+            <w:shd w:fill="FFFFFF" w:val="clear"/>
+            <w:tcMar>
+              <w:top w:type="dxa" w:w="80"/>
+              <w:left w:type="dxa" w:w="120"/>
+              <w:bottom w:type="dxa" w:w="80"/>
+              <w:right w:type="dxa" w:w="120"/>
+            </w:tcMar>
+          </w:tcPr>
+          <w:p>
+            <w:r>
+              <w:t xml:space="preserve">CRM/PIM/Claims/FSM connector HTTP</w:t>
+            </w:r>
+          </w:p>
+        </w:tc>
+        <w:tc>
+          <w:tcPr>
+            <w:tcW w:type="dxa" w:w="1360"/>
+            <w:tcBorders>
+              <w:top w:val="single" w:color="CCCCCC" w:sz="1"/>
+              <w:left w:val="single" w:color="CCCCCC" w:sz="1"/>
+              <w:bottom w:val="single" w:color="CCCCCC" w:sz="1"/>
+              <w:right w:val="single" w:color="CCCCCC" w:sz="1"/>
+            </w:tcBorders>
+            <w:shd w:fill="FFFFFF" w:val="clear"/>
+            <w:tcMar>
+              <w:top w:type="dxa" w:w="80"/>
+              <w:left w:type="dxa" w:w="120"/>
+              <w:bottom w:type="dxa" w:w="80"/>
+              <w:right w:type="dxa" w:w="120"/>
+            </w:tcMar>
+          </w:tcPr>
+          <w:p>
+            <w:r>
+              <w:t xml:space="preserve">Enterprise path</w:t>
+            </w:r>
+          </w:p>
+        </w:tc>
+      </w:tr>
+      <w:tr>
+        <w:tc>
+          <w:tcPr>
+            <w:tcW w:type="dxa" w:w="1600"/>
+            <w:tcBorders>
+              <w:top w:val="single" w:color="CCCCCC" w:sz="1"/>
+              <w:left w:val="single" w:color="CCCCCC" w:sz="1"/>
+              <w:bottom w:val="single" w:color="CCCCCC" w:sz="1"/>
+              <w:right w:val="single" w:color="CCCCCC" w:sz="1"/>
+            </w:tcBorders>
+            <w:shd w:fill="FFFFFF" w:val="clear"/>
+            <w:tcMar>
+              <w:top w:type="dxa" w:w="80"/>
+              <w:left w:type="dxa" w:w="120"/>
+              <w:bottom w:type="dxa" w:w="80"/>
+              <w:right w:type="dxa" w:w="120"/>
+            </w:tcMar>
+          </w:tcPr>
+          <w:p>
+            <w:r>
+              <w:t xml:space="preserve">Infrastructure</w:t>
+            </w:r>
+          </w:p>
+        </w:tc>
+        <w:tc>
+          <w:tcPr>
+            <w:tcW w:type="dxa" w:w="2800"/>
+            <w:tcBorders>
+              <w:top w:val="single" w:color="CCCCCC" w:sz="1"/>
+              <w:left w:val="single" w:color="CCCCCC" w:sz="1"/>
+              <w:bottom w:val="single" w:color="CCCCCC" w:sz="1"/>
+              <w:right w:val="single" w:color="CCCCCC" w:sz="1"/>
+            </w:tcBorders>
+            <w:shd w:fill="FFFFFF" w:val="clear"/>
+            <w:tcMar>
+              <w:top w:type="dxa" w:w="80"/>
+              <w:left w:type="dxa" w:w="120"/>
+              <w:bottom w:type="dxa" w:w="80"/>
+              <w:right w:type="dxa" w:w="120"/>
+            </w:tcMar>
+          </w:tcPr>
+          <w:p>
+            <w:r>
+              <w:t xml:space="preserve">Docker (neo4j-demo)</w:t>
+            </w:r>
+          </w:p>
+        </w:tc>
+        <w:tc>
+          <w:tcPr>
+            <w:tcW w:type="dxa" w:w="3600"/>
+            <w:tcBorders>
+              <w:top w:val="single" w:color="CCCCCC" w:sz="1"/>
+              <w:left w:val="single" w:color="CCCCCC" w:sz="1"/>
+              <w:bottom w:val="single" w:color="CCCCCC" w:sz="1"/>
+              <w:right w:val="single" w:color="CCCCCC" w:sz="1"/>
+            </w:tcBorders>
+            <w:shd w:fill="FFFFFF" w:val="clear"/>
+            <w:tcMar>
+              <w:top w:type="dxa" w:w="80"/>
+              <w:left w:type="dxa" w:w="120"/>
+              <w:bottom w:type="dxa" w:w="80"/>
+              <w:right w:type="dxa" w:w="120"/>
+            </w:tcMar>
+          </w:tcPr>
+          <w:p>
+            <w:r>
+              <w:t xml:space="preserve">Local graph database</w:t>
+            </w:r>
+          </w:p>
+        </w:tc>
+        <w:tc>
+          <w:tcPr>
+            <w:tcW w:type="dxa" w:w="1360"/>
+            <w:tcBorders>
+              <w:top w:val="single" w:color="CCCCCC" w:sz="1"/>
+              <w:left w:val="single" w:color="CCCCCC" w:sz="1"/>
+              <w:bottom w:val="single" w:color="CCCCCC" w:sz="1"/>
+              <w:right w:val="single" w:color="CCCCCC" w:sz="1"/>
+            </w:tcBorders>
+            <w:shd w:fill="FFFFFF" w:val="clear"/>
+            <w:tcMar>
+              <w:top w:type="dxa" w:w="80"/>
+              <w:left w:type="dxa" w:w="120"/>
+              <w:bottom w:type="dxa" w:w="80"/>
+              <w:right w:type="dxa" w:w="120"/>
+            </w:tcMar>
+          </w:tcPr>
+          <w:p>
+            <w:r>
+              <w:t xml:space="preserve">Local dev</w:t>
+            </w:r>
+          </w:p>
+        </w:tc>
+      </w:tr>
+      <w:tr>
+        <w:tc>
+          <w:tcPr>
+            <w:tcW w:type="dxa" w:w="1600"/>
+            <w:tcBorders>
+              <w:top w:val="single" w:color="CCCCCC" w:sz="1"/>
+              <w:left w:val="single" w:color="CCCCCC" w:sz="1"/>
+              <w:bottom w:val="single" w:color="CCCCCC" w:sz="1"/>
+              <w:right w:val="single" w:color="CCCCCC" w:sz="1"/>
+            </w:tcBorders>
+            <w:shd w:fill="FFFFFF" w:val="clear"/>
+            <w:tcMar>
+              <w:top w:type="dxa" w:w="80"/>
+              <w:left w:type="dxa" w:w="120"/>
+              <w:bottom w:type="dxa" w:w="80"/>
+              <w:right w:type="dxa" w:w="120"/>
+            </w:tcMar>
+          </w:tcPr>
+          <w:p>
+            <w:r>
+              <w:t xml:space="preserve">Infrastructure</w:t>
+            </w:r>
+          </w:p>
+        </w:tc>
+        <w:tc>
+          <w:tcPr>
+            <w:tcW w:type="dxa" w:w="2800"/>
+            <w:tcBorders>
+              <w:top w:val="single" w:color="CCCCCC" w:sz="1"/>
+              <w:left w:val="single" w:color="CCCCCC" w:sz="1"/>
+              <w:bottom w:val="single" w:color="CCCCCC" w:sz="1"/>
+              <w:right w:val="single" w:color="CCCCCC" w:sz="1"/>
+            </w:tcBorders>
+            <w:shd w:fill="FFFFFF" w:val="clear"/>
+            <w:tcMar>
+              <w:top w:type="dxa" w:w="80"/>
+              <w:left w:type="dxa" w:w="120"/>
+              <w:bottom w:type="dxa" w:w="80"/>
+              <w:right w:type="dxa" w:w="120"/>
+            </w:tcMar>
+          </w:tcPr>
+          <w:p>
+            <w:r>
+              <w:t xml:space="preserve">Mock Enterprise APIs (:8090)</w:t>
+            </w:r>
+          </w:p>
+        </w:tc>
+        <w:tc>
+          <w:tcPr>
+            <w:tcW w:type="dxa" w:w="3600"/>
+            <w:tcBorders>
+              <w:top w:val="single" w:color="CCCCCC" w:sz="1"/>
+              <w:left w:val="single" w:color="CCCCCC" w:sz="1"/>
+              <w:bottom w:val="single" w:color="CCCCCC" w:sz="1"/>
+              <w:right w:val="single" w:color="CCCCCC" w:sz="1"/>
+            </w:tcBorders>
+            <w:shd w:fill="FFFFFF" w:val="clear"/>
+            <w:tcMar>
+              <w:top w:type="dxa" w:w="80"/>
+              <w:left w:type="dxa" w:w="120"/>
+              <w:bottom w:type="dxa" w:w="80"/>
+              <w:right w:type="dxa" w:w="120"/>
+            </w:tcMar>
+          </w:tcPr>
+          <w:p>
+            <w:r>
+              <w:t xml:space="preserve">Simulated CRM, PIM, FSM, Claims</w:t>
+            </w:r>
+          </w:p>
+        </w:tc>
+        <w:tc>
+          <w:tcPr>
+            <w:tcW w:type="dxa" w:w="1360"/>
+            <w:tcBorders>
+              <w:top w:val="single" w:color="CCCCCC" w:sz="1"/>
+              <w:left w:val="single" w:color="CCCCCC" w:sz="1"/>
+              <w:bottom w:val="single" w:color="CCCCCC" w:sz="1"/>
+              <w:right w:val="single" w:color="CCCCCC" w:sz="1"/>
+            </w:tcBorders>
+            <w:shd w:fill="FFFFFF" w:val="clear"/>
+            <w:tcMar>
+              <w:top w:type="dxa" w:w="80"/>
+              <w:left w:type="dxa" w:w="120"/>
+              <w:bottom w:type="dxa" w:w="80"/>
+              <w:right w:type="dxa" w:w="120"/>
+            </w:tcMar>
+          </w:tcPr>
+          <w:p>
+            <w:r>
+              <w:t xml:space="preserve">Default demo</w:t>
+            </w:r>
+          </w:p>
+        </w:tc>
+      </w:tr>
+      <w:tr>
+        <w:tc>
+          <w:tcPr>
+            <w:tcW w:type="dxa" w:w="1600"/>
+            <w:tcBorders>
+              <w:top w:val="single" w:color="CCCCCC" w:sz="1"/>
+              <w:left w:val="single" w:color="CCCCCC" w:sz="1"/>
+              <w:bottom w:val="single" w:color="CCCCCC" w:sz="1"/>
+              <w:right w:val="single" w:color="CCCCCC" w:sz="1"/>
+            </w:tcBorders>
+            <w:shd w:fill="FFFFFF" w:val="clear"/>
+            <w:tcMar>
+              <w:top w:type="dxa" w:w="80"/>
+              <w:left w:type="dxa" w:w="120"/>
+              <w:bottom w:type="dxa" w:w="80"/>
+              <w:right w:type="dxa" w:w="120"/>
+            </w:tcMar>
+          </w:tcPr>
+          <w:p>
+            <w:r>
+              <w:t xml:space="preserve">Optional</w:t>
+            </w:r>
+          </w:p>
+        </w:tc>
+        <w:tc>
+          <w:tcPr>
+            <w:tcW w:type="dxa" w:w="2800"/>
+            <w:tcBorders>
+              <w:top w:val="single" w:color="CCCCCC" w:sz="1"/>
+              <w:left w:val="single" w:color="CCCCCC" w:sz="1"/>
+              <w:bottom w:val="single" w:color="CCCCCC" w:sz="1"/>
+              <w:right w:val="single" w:color="CCCCCC" w:sz="1"/>
+            </w:tcBorders>
+            <w:shd w:fill="FFFFFF" w:val="clear"/>
+            <w:tcMar>
+              <w:top w:type="dxa" w:w="80"/>
+              <w:left w:type="dxa" w:w="120"/>
+              <w:bottom w:type="dxa" w:w="80"/>
+              <w:right w:type="dxa" w:w="120"/>
+            </w:tcMar>
+          </w:tcPr>
+          <w:p>
+            <w:r>
+              <w:t xml:space="preserve">XAI_API_KEY / OPENAI_API_KEY</w:t>
+            </w:r>
+          </w:p>
+        </w:tc>
+        <w:tc>
+          <w:tcPr>
+            <w:tcW w:type="dxa" w:w="3600"/>
+            <w:tcBorders>
+              <w:top w:val="single" w:color="CCCCCC" w:sz="1"/>
+              <w:left w:val="single" w:color="CCCCCC" w:sz="1"/>
+              <w:bottom w:val="single" w:color="CCCCCC" w:sz="1"/>
+              <w:right w:val="single" w:color="CCCCCC" w:sz="1"/>
+            </w:tcBorders>
+            <w:shd w:fill="FFFFFF" w:val="clear"/>
+            <w:tcMar>
+              <w:top w:type="dxa" w:w="80"/>
+              <w:left w:type="dxa" w:w="120"/>
+              <w:bottom w:type="dxa" w:w="80"/>
+              <w:right w:type="dxa" w:w="120"/>
+            </w:tcMar>
+          </w:tcPr>
+          <w:p>
+            <w:r>
+              <w:t xml:space="preserve">Future LLM-enhanced formatting</w:t>
+            </w:r>
+          </w:p>
+        </w:tc>
+        <w:tc>
+          <w:tcPr>
+            <w:tcW w:type="dxa" w:w="1360"/>
+            <w:tcBorders>
+              <w:top w:val="single" w:color="CCCCCC" w:sz="1"/>
+              <w:left w:val="single" w:color="CCCCCC" w:sz="1"/>
+              <w:bottom w:val="single" w:color="CCCCCC" w:sz="1"/>
+              <w:right w:val="single" w:color="CCCCCC" w:sz="1"/>
+            </w:tcBorders>
+            <w:shd w:fill="FFFFFF" w:val="clear"/>
+            <w:tcMar>
+              <w:top w:type="dxa" w:w="80"/>
+              <w:left w:type="dxa" w:w="120"/>
+              <w:bottom w:type="dxa" w:w="80"/>
+              <w:right w:type="dxa" w:w="120"/>
+            </w:tcMar>
+          </w:tcPr>
+          <w:p>
+            <w:r>
+              <w:t xml:space="preserve">No</w:t>
+            </w:r>
+          </w:p>
+        </w:tc>
+      </w:tr>
+    </w:tbl>
+    <w:p>
+      <w:pPr>
+        <w:spacing w:after="200"/>
+      </w:pPr>
+    </w:p>
+    <w:p>
+      <w:pPr>
+        <w:pStyle w:val="Heading2"/>
+      </w:pPr>
+      <w:r>
+        <w:t xml:space="preserve">10.3 Assumptions</w:t>
+      </w:r>
+    </w:p>
+    <w:p>
+      <w:pPr>
+        <w:pStyle w:val="ListParagraph"/>
+        <w:numPr>
+          <w:ilvl w:val="0"/>
+          <w:numId w:val="2"/>
+        </w:numPr>
+        <w:spacing w:after="80"/>
+      </w:pPr>
+      <w:r>
+        <w:t xml:space="preserve">Demo knowledge covers three appliance families (wm-001, dw-001, mw-001) — not hundreds of production SKUs</w:t>
+      </w:r>
+    </w:p>
+    <w:p>
+      <w:pPr>
+        <w:pStyle w:val="ListParagraph"/>
+        <w:numPr>
+          <w:ilvl w:val="0"/>
+          <w:numId w:val="2"/>
+        </w:numPr>
+        <w:spacing w:after="80"/>
+      </w:pPr>
+      <w:r>
+        <w:t xml:space="preserve">USE_MOCK_ENTERPRISE_APIS=true by default; real connector URLs require authenticated implementations</w:t>
+      </w:r>
+    </w:p>
+    <w:p>
+      <w:pPr>
+        <w:pStyle w:val="ListParagraph"/>
+        <w:numPr>
+          <w:ilvl w:val="0"/>
+          <w:numId w:val="2"/>
+        </w:numPr>
+        <w:spacing w:after="80"/>
+      </w:pPr>
+      <w:r>
+        <w:t xml:space="preserve">Diagnosis is graph-native (Cypher + lexical matching); LLM is optional augmentation only</w:t>
+      </w:r>
+    </w:p>
+    <w:p>
+      <w:pPr>
+        <w:pStyle w:val="ListParagraph"/>
+        <w:numPr>
+          <w:ilvl w:val="0"/>
+          <w:numId w:val="2"/>
+        </w:numPr>
+        <w:spacing w:after="80"/>
+      </w:pPr>
+      <w:r>
+        <w:t xml:space="preserve">Single Neo4j instance serves both staging and runtime in the demo</w:t>
+      </w:r>
+    </w:p>
+    <w:p>
+      <w:pPr>
+        <w:pStyle w:val="ListParagraph"/>
+        <w:numPr>
+          <w:ilvl w:val="0"/>
+          <w:numId w:val="2"/>
+        </w:numPr>
+        <w:spacing w:after="80"/>
+      </w:pPr>
+      <w:r>
+        <w:t xml:space="preserve">Escalation fires at confidence &lt; 65% or on any critical-severity matched symptom</w:t>
+      </w:r>
+    </w:p>
+    <w:p>
+      <w:pPr>
+        <w:pStyle w:val="ListParagraph"/>
+        <w:numPr>
+          <w:ilvl w:val="0"/>
+          <w:numId w:val="2"/>
+        </w:numPr>
+        <w:spacing w:after="80"/>
+      </w:pPr>
+      <w:r>
+        <w:t xml:space="preserve">Customer PII remains in CRM at runtime — not persisted in the knowledge graph</w:t>
+      </w:r>
+    </w:p>
+    <w:p>
+      <w:pPr>
+        <w:pStyle w:val="ListParagraph"/>
+        <w:numPr>
+          <w:ilvl w:val="0"/>
+          <w:numId w:val="2"/>
+        </w:numPr>
+        <w:spacing w:after="80"/>
+      </w:pPr>
+      <w:r>
+        <w:t xml:space="preserve">Escalation and case handoff use local JSON persistence in demo mode</w:t>
+      </w:r>
+    </w:p>
+    <w:p>
+      <w:pPr>
+        <w:pStyle w:val="Heading2"/>
+      </w:pPr>
+      <w:r>
+        <w:t xml:space="preserve">10.4 Risk Mitigation</w:t>
+      </w:r>
+    </w:p>
+    <w:tbl>
+      <w:tblPr>
+        <w:tblW w:type="dxa" w:w="9360"/>
+        <w:tblBorders>
+          <w:top w:val="single" w:color="auto" w:sz="4"/>
+          <w:left w:val="single" w:color="auto" w:sz="4"/>
+          <w:bottom w:val="single" w:color="auto" w:sz="4"/>
+          <w:right w:val="single" w:color="auto" w:sz="4"/>
+          <w:insideH w:val="single" w:color="auto" w:sz="4"/>
+          <w:insideV w:val="single" w:color="auto" w:sz="4"/>
+        </w:tblBorders>
+      </w:tblPr>
+      <w:tblGrid>
+        <w:gridCol w:w="2800"/>
+        <w:gridCol w:w="1200"/>
+        <w:gridCol w:w="1200"/>
+        <w:gridCol w:w="4160"/>
+      </w:tblGrid>
+      <w:tr>
+        <w:tc>
+          <w:tcPr>
+            <w:tcW w:type="dxa" w:w="2800"/>
+            <w:tcBorders>
+              <w:top w:val="single" w:color="CCCCCC" w:sz="1"/>
+              <w:left w:val="single" w:color="CCCCCC" w:sz="1"/>
+              <w:bottom w:val="single" w:color="CCCCCC" w:sz="1"/>
+              <w:right w:val="single" w:color="CCCCCC" w:sz="1"/>
+            </w:tcBorders>
+            <w:shd w:fill="2E75B6" w:val="clear"/>
+            <w:tcMar>
+              <w:top w:type="dxa" w:w="80"/>
+              <w:left w:type="dxa" w:w="120"/>
+              <w:bottom w:type="dxa" w:w="80"/>
+              <w:right w:type="dxa" w:w="120"/>
+            </w:tcMar>
+          </w:tcPr>
+          <w:p>
+            <w:r>
+              <w:rPr>
+                <w:b/>
+                <w:bCs/>
+                <w:color w:val="FFFFFF"/>
+              </w:rPr>
+              <w:t xml:space="preserve">Risk</w:t>
+            </w:r>
+          </w:p>
+        </w:tc>
+        <w:tc>
+          <w:tcPr>
+            <w:tcW w:type="dxa" w:w="1200"/>
+            <w:tcBorders>
+              <w:top w:val="single" w:color="CCCCCC" w:sz="1"/>
+              <w:left w:val="single" w:color="CCCCCC" w:sz="1"/>
+              <w:bottom w:val="single" w:color="CCCCCC" w:sz="1"/>
+              <w:right w:val="single" w:color="CCCCCC" w:sz="1"/>
+            </w:tcBorders>
+            <w:shd w:fill="2E75B6" w:val="clear"/>
+            <w:tcMar>
+              <w:top w:type="dxa" w:w="80"/>
+              <w:left w:type="dxa" w:w="120"/>
+              <w:bottom w:type="dxa" w:w="80"/>
+              <w:right w:type="dxa" w:w="120"/>
+            </w:tcMar>
+          </w:tcPr>
+          <w:p>
+            <w:r>
+              <w:rPr>
+                <w:b/>
+                <w:bCs/>
+                <w:color w:val="FFFFFF"/>
+              </w:rPr>
+              <w:t xml:space="preserve">Likelihood</w:t>
+            </w:r>
+          </w:p>
+        </w:tc>
+        <w:tc>
+          <w:tcPr>
+            <w:tcW w:type="dxa" w:w="1200"/>
+            <w:tcBorders>
+              <w:top w:val="single" w:color="CCCCCC" w:sz="1"/>
+              <w:left w:val="single" w:color="CCCCCC" w:sz="1"/>
+              <w:bottom w:val="single" w:color="CCCCCC" w:sz="1"/>
+              <w:right w:val="single" w:color="CCCCCC" w:sz="1"/>
+            </w:tcBorders>
+            <w:shd w:fill="2E75B6" w:val="clear"/>
+            <w:tcMar>
+              <w:top w:type="dxa" w:w="80"/>
+              <w:left w:type="dxa" w:w="120"/>
+              <w:bottom w:type="dxa" w:w="80"/>
+              <w:right w:type="dxa" w:w="120"/>
+            </w:tcMar>
+          </w:tcPr>
+          <w:p>
+            <w:r>
+              <w:rPr>
+                <w:b/>
+                <w:bCs/>
+                <w:color w:val="FFFFFF"/>
+              </w:rPr>
+              <w:t xml:space="preserve">Impact</w:t>
+            </w:r>
+          </w:p>
+        </w:tc>
+        <w:tc>
+          <w:tcPr>
+            <w:tcW w:type="dxa" w:w="4160"/>
+            <w:tcBorders>
+              <w:top w:val="single" w:color="CCCCCC" w:sz="1"/>
+              <w:left w:val="single" w:color="CCCCCC" w:sz="1"/>
+              <w:bottom w:val="single" w:color="CCCCCC" w:sz="1"/>
+              <w:right w:val="single" w:color="CCCCCC" w:sz="1"/>
+            </w:tcBorders>
+            <w:shd w:fill="2E75B6" w:val="clear"/>
+            <w:tcMar>
+              <w:top w:type="dxa" w:w="80"/>
+              <w:left w:type="dxa" w:w="120"/>
+              <w:bottom w:type="dxa" w:w="80"/>
+              <w:right w:type="dxa" w:w="120"/>
+            </w:tcMar>
+          </w:tcPr>
+          <w:p>
+            <w:r>
+              <w:rPr>
+                <w:b/>
+                <w:bCs/>
+                <w:color w:val="FFFFFF"/>
+              </w:rPr>
+              <w:t xml:space="preserve">Mitigation</w:t>
+            </w:r>
+          </w:p>
+        </w:tc>
+      </w:tr>
+      <w:tr>
+        <w:tc>
+          <w:tcPr>
+            <w:tcW w:type="dxa" w:w="2800"/>
+            <w:tcBorders>
+              <w:top w:val="single" w:color="CCCCCC" w:sz="1"/>
+              <w:left w:val="single" w:color="CCCCCC" w:sz="1"/>
+              <w:bottom w:val="single" w:color="CCCCCC" w:sz="1"/>
+              <w:right w:val="single" w:color="CCCCCC" w:sz="1"/>
+            </w:tcBorders>
+            <w:shd w:fill="FFFFFF" w:val="clear"/>
+            <w:tcMar>
+              <w:top w:type="dxa" w:w="80"/>
+              <w:left w:type="dxa" w:w="120"/>
+              <w:bottom w:type="dxa" w:w="80"/>
+              <w:right w:type="dxa" w:w="120"/>
+            </w:tcMar>
+          </w:tcPr>
+          <w:p>
+            <w:r>
+              <w:t xml:space="preserve">Unsafe repair guidance</w:t>
+            </w:r>
+          </w:p>
+        </w:tc>
+        <w:tc>
+          <w:tcPr>
+            <w:tcW w:type="dxa" w:w="1200"/>
+            <w:tcBorders>
+              <w:top w:val="single" w:color="CCCCCC" w:sz="1"/>
+              <w:left w:val="single" w:color="CCCCCC" w:sz="1"/>
+              <w:bottom w:val="single" w:color="CCCCCC" w:sz="1"/>
+              <w:right w:val="single" w:color="CCCCCC" w:sz="1"/>
+            </w:tcBorders>
+            <w:shd w:fill="FFFFFF" w:val="clear"/>
+            <w:tcMar>
+              <w:top w:type="dxa" w:w="80"/>
+              <w:left w:type="dxa" w:w="120"/>
+              <w:bottom w:type="dxa" w:w="80"/>
+              <w:right w:type="dxa" w:w="120"/>
+            </w:tcMar>
+          </w:tcPr>
+          <w:p>
+            <w:r>
+              <w:t xml:space="preserve">Medium</w:t>
+            </w:r>
+          </w:p>
+        </w:tc>
+        <w:tc>
+          <w:tcPr>
+            <w:tcW w:type="dxa" w:w="1200"/>
+            <w:tcBorders>
+              <w:top w:val="single" w:color="CCCCCC" w:sz="1"/>
+              <w:left w:val="single" w:color="CCCCCC" w:sz="1"/>
+              <w:bottom w:val="single" w:color="CCCCCC" w:sz="1"/>
+              <w:right w:val="single" w:color="CCCCCC" w:sz="1"/>
+            </w:tcBorders>
+            <w:shd w:fill="FFFFFF" w:val="clear"/>
+            <w:tcMar>
+              <w:top w:type="dxa" w:w="80"/>
+              <w:left w:type="dxa" w:w="120"/>
+              <w:bottom w:type="dxa" w:w="80"/>
+              <w:right w:type="dxa" w:w="120"/>
+            </w:tcMar>
+          </w:tcPr>
+          <w:p>
+            <w:r>
+              <w:t xml:space="preserve">Critical</w:t>
+            </w:r>
+          </w:p>
+        </w:tc>
+        <w:tc>
+          <w:tcPr>
+            <w:tcW w:type="dxa" w:w="4160"/>
+            <w:tcBorders>
+              <w:top w:val="single" w:color="CCCCCC" w:sz="1"/>
+              <w:left w:val="single" w:color="CCCCCC" w:sz="1"/>
+              <w:bottom w:val="single" w:color="CCCCCC" w:sz="1"/>
+              <w:right w:val="single" w:color="CCCCCC" w:sz="1"/>
+            </w:tcBorders>
+            <w:shd w:fill="FFFFFF" w:val="clear"/>
+            <w:tcMar>
+              <w:top w:type="dxa" w:w="80"/>
+              <w:left w:type="dxa" w:w="120"/>
+              <w:bottom w:type="dxa" w:w="80"/>
+              <w:right w:type="dxa" w:w="120"/>
+            </w:tcMar>
+          </w:tcPr>
+          <w:p>
+            <w:r>
+              <w:t xml:space="preserve">Safety notes on failure modes; critical symptoms force escalation</w:t>
+            </w:r>
+          </w:p>
+        </w:tc>
+      </w:tr>
+      <w:tr>
+        <w:tc>
+          <w:tcPr>
+            <w:tcW w:type="dxa" w:w="2800"/>
+            <w:tcBorders>
+              <w:top w:val="single" w:color="CCCCCC" w:sz="1"/>
+              <w:left w:val="single" w:color="CCCCCC" w:sz="1"/>
+              <w:bottom w:val="single" w:color="CCCCCC" w:sz="1"/>
+              <w:right w:val="single" w:color="CCCCCC" w:sz="1"/>
+            </w:tcBorders>
+            <w:shd w:fill="FFFFFF" w:val="clear"/>
+            <w:tcMar>
+              <w:top w:type="dxa" w:w="80"/>
+              <w:left w:type="dxa" w:w="120"/>
+              <w:bottom w:type="dxa" w:w="80"/>
+              <w:right w:type="dxa" w:w="120"/>
+            </w:tcMar>
+          </w:tcPr>
+          <w:p>
+            <w:r>
+              <w:t xml:space="preserve">Low-confidence misdiagnosis</w:t>
+            </w:r>
+          </w:p>
+        </w:tc>
+        <w:tc>
+          <w:tcPr>
+            <w:tcW w:type="dxa" w:w="1200"/>
+            <w:tcBorders>
+              <w:top w:val="single" w:color="CCCCCC" w:sz="1"/>
+              <w:left w:val="single" w:color="CCCCCC" w:sz="1"/>
+              <w:bottom w:val="single" w:color="CCCCCC" w:sz="1"/>
+              <w:right w:val="single" w:color="CCCCCC" w:sz="1"/>
+            </w:tcBorders>
+            <w:shd w:fill="FFFFFF" w:val="clear"/>
+            <w:tcMar>
+              <w:top w:type="dxa" w:w="80"/>
+              <w:left w:type="dxa" w:w="120"/>
+              <w:bottom w:type="dxa" w:w="80"/>
+              <w:right w:type="dxa" w:w="120"/>
+            </w:tcMar>
+          </w:tcPr>
+          <w:p>
+            <w:r>
+              <w:t xml:space="preserve">Medium</w:t>
+            </w:r>
+          </w:p>
+        </w:tc>
+        <w:tc>
+          <w:tcPr>
+            <w:tcW w:type="dxa" w:w="1200"/>
+            <w:tcBorders>
+              <w:top w:val="single" w:color="CCCCCC" w:sz="1"/>
+              <w:left w:val="single" w:color="CCCCCC" w:sz="1"/>
+              <w:bottom w:val="single" w:color="CCCCCC" w:sz="1"/>
+              <w:right w:val="single" w:color="CCCCCC" w:sz="1"/>
+            </w:tcBorders>
+            <w:shd w:fill="FFFFFF" w:val="clear"/>
+            <w:tcMar>
+              <w:top w:type="dxa" w:w="80"/>
+              <w:left w:type="dxa" w:w="120"/>
+              <w:bottom w:type="dxa" w:w="80"/>
+              <w:right w:type="dxa" w:w="120"/>
+            </w:tcMar>
+          </w:tcPr>
+          <w:p>
+            <w:r>
+              <w:t xml:space="preserve">High</w:t>
+            </w:r>
+          </w:p>
+        </w:tc>
+        <w:tc>
+          <w:tcPr>
+            <w:tcW w:type="dxa" w:w="4160"/>
+            <w:tcBorders>
+              <w:top w:val="single" w:color="CCCCCC" w:sz="1"/>
+              <w:left w:val="single" w:color="CCCCCC" w:sz="1"/>
+              <w:bottom w:val="single" w:color="CCCCCC" w:sz="1"/>
+              <w:right w:val="single" w:color="CCCCCC" w:sz="1"/>
+            </w:tcBorders>
+            <w:shd w:fill="FFFFFF" w:val="clear"/>
+            <w:tcMar>
+              <w:top w:type="dxa" w:w="80"/>
+              <w:left w:type="dxa" w:w="120"/>
+              <w:bottom w:type="dxa" w:w="80"/>
+              <w:right w:type="dxa" w:w="120"/>
+            </w:tcMar>
+          </w:tcPr>
+          <w:p>
+            <w:r>
+              <w:t xml:space="preserve">ESCALATION_CONFIDENCE_THRESHOLD; multi-symptom confidence dilution</w:t>
+            </w:r>
+          </w:p>
+        </w:tc>
+      </w:tr>
+      <w:tr>
+        <w:tc>
+          <w:tcPr>
+            <w:tcW w:type="dxa" w:w="2800"/>
+            <w:tcBorders>
+              <w:top w:val="single" w:color="CCCCCC" w:sz="1"/>
+              <w:left w:val="single" w:color="CCCCCC" w:sz="1"/>
+              <w:bottom w:val="single" w:color="CCCCCC" w:sz="1"/>
+              <w:right w:val="single" w:color="CCCCCC" w:sz="1"/>
+            </w:tcBorders>
+            <w:shd w:fill="FFFFFF" w:val="clear"/>
+            <w:tcMar>
+              <w:top w:type="dxa" w:w="80"/>
+              <w:left w:type="dxa" w:w="120"/>
+              <w:bottom w:type="dxa" w:w="80"/>
+              <w:right w:type="dxa" w:w="120"/>
+            </w:tcMar>
+          </w:tcPr>
+          <w:p>
+            <w:r>
+              <w:t xml:space="preserve">LLM hallucination (future)</w:t>
+            </w:r>
+          </w:p>
+        </w:tc>
+        <w:tc>
+          <w:tcPr>
+            <w:tcW w:type="dxa" w:w="1200"/>
+            <w:tcBorders>
+              <w:top w:val="single" w:color="CCCCCC" w:sz="1"/>
+              <w:left w:val="single" w:color="CCCCCC" w:sz="1"/>
+              <w:bottom w:val="single" w:color="CCCCCC" w:sz="1"/>
+              <w:right w:val="single" w:color="CCCCCC" w:sz="1"/>
+            </w:tcBorders>
+            <w:shd w:fill="FFFFFF" w:val="clear"/>
+            <w:tcMar>
+              <w:top w:type="dxa" w:w="80"/>
+              <w:left w:type="dxa" w:w="120"/>
+              <w:bottom w:type="dxa" w:w="80"/>
+              <w:right w:type="dxa" w:w="120"/>
+            </w:tcMar>
+          </w:tcPr>
+          <w:p>
+            <w:r>
+              <w:t xml:space="preserve">Medium</w:t>
+            </w:r>
+          </w:p>
+        </w:tc>
+        <w:tc>
+          <w:tcPr>
+            <w:tcW w:type="dxa" w:w="1200"/>
+            <w:tcBorders>
+              <w:top w:val="single" w:color="CCCCCC" w:sz="1"/>
+              <w:left w:val="single" w:color="CCCCCC" w:sz="1"/>
+              <w:bottom w:val="single" w:color="CCCCCC" w:sz="1"/>
+              <w:right w:val="single" w:color="CCCCCC" w:sz="1"/>
+            </w:tcBorders>
+            <w:shd w:fill="FFFFFF" w:val="clear"/>
+            <w:tcMar>
+              <w:top w:type="dxa" w:w="80"/>
+              <w:left w:type="dxa" w:w="120"/>
+              <w:bottom w:type="dxa" w:w="80"/>
+              <w:right w:type="dxa" w:w="120"/>
+            </w:tcMar>
+          </w:tcPr>
+          <w:p>
+            <w:r>
+              <w:t xml:space="preserve">High</w:t>
+            </w:r>
+          </w:p>
+        </w:tc>
+        <w:tc>
+          <w:tcPr>
+            <w:tcW w:type="dxa" w:w="4160"/>
+            <w:tcBorders>
+              <w:top w:val="single" w:color="CCCCCC" w:sz="1"/>
+              <w:left w:val="single" w:color="CCCCCC" w:sz="1"/>
+              <w:bottom w:val="single" w:color="CCCCCC" w:sz="1"/>
+              <w:right w:val="single" w:color="CCCCCC" w:sz="1"/>
+            </w:tcBorders>
+            <w:shd w:fill="FFFFFF" w:val="clear"/>
+            <w:tcMar>
+              <w:top w:type="dxa" w:w="80"/>
+              <w:left w:type="dxa" w:w="120"/>
+              <w:bottom w:type="dxa" w:w="80"/>
+              <w:right w:type="dxa" w:w="120"/>
+            </w:tcMar>
+          </w:tcPr>
+          <w:p>
+            <w:r>
+              <w:t xml:space="preserve">Graph truth layer unchanged; LLM formatting only</w:t>
+            </w:r>
+          </w:p>
+        </w:tc>
+      </w:tr>
+      <w:tr>
+        <w:tc>
+          <w:tcPr>
+            <w:tcW w:type="dxa" w:w="2800"/>
+            <w:tcBorders>
+              <w:top w:val="single" w:color="CCCCCC" w:sz="1"/>
+              <w:left w:val="single" w:color="CCCCCC" w:sz="1"/>
+              <w:bottom w:val="single" w:color="CCCCCC" w:sz="1"/>
+              <w:right w:val="single" w:color="CCCCCC" w:sz="1"/>
+            </w:tcBorders>
+            <w:shd w:fill="FFFFFF" w:val="clear"/>
+            <w:tcMar>
+              <w:top w:type="dxa" w:w="80"/>
+              <w:left w:type="dxa" w:w="120"/>
+              <w:bottom w:type="dxa" w:w="80"/>
+              <w:right w:type="dxa" w:w="120"/>
+            </w:tcMar>
+          </w:tcPr>
+          <w:p>
+            <w:r>
+              <w:t xml:space="preserve">Stale or corrupt knowledge</w:t>
+            </w:r>
+          </w:p>
+        </w:tc>
+        <w:tc>
+          <w:tcPr>
+            <w:tcW w:type="dxa" w:w="1200"/>
+            <w:tcBorders>
+              <w:top w:val="single" w:color="CCCCCC" w:sz="1"/>
+              <w:left w:val="single" w:color="CCCCCC" w:sz="1"/>
+              <w:bottom w:val="single" w:color="CCCCCC" w:sz="1"/>
+              <w:right w:val="single" w:color="CCCCCC" w:sz="1"/>
+            </w:tcBorders>
+            <w:shd w:fill="FFFFFF" w:val="clear"/>
+            <w:tcMar>
+              <w:top w:type="dxa" w:w="80"/>
+              <w:left w:type="dxa" w:w="120"/>
+              <w:bottom w:type="dxa" w:w="80"/>
+              <w:right w:type="dxa" w:w="120"/>
+            </w:tcMar>
+          </w:tcPr>
+          <w:p>
+            <w:r>
+              <w:t xml:space="preserve">Medium</w:t>
+            </w:r>
+          </w:p>
+        </w:tc>
+        <w:tc>
+          <w:tcPr>
+            <w:tcW w:type="dxa" w:w="1200"/>
+            <w:tcBorders>
+              <w:top w:val="single" w:color="CCCCCC" w:sz="1"/>
+              <w:left w:val="single" w:color="CCCCCC" w:sz="1"/>
+              <w:bottom w:val="single" w:color="CCCCCC" w:sz="1"/>
+              <w:right w:val="single" w:color="CCCCCC" w:sz="1"/>
+            </w:tcBorders>
+            <w:shd w:fill="FFFFFF" w:val="clear"/>
+            <w:tcMar>
+              <w:top w:type="dxa" w:w="80"/>
+              <w:left w:type="dxa" w:w="120"/>
+              <w:bottom w:type="dxa" w:w="80"/>
+              <w:right w:type="dxa" w:w="120"/>
+            </w:tcMar>
+          </w:tcPr>
+          <w:p>
+            <w:r>
+              <w:t xml:space="preserve">High</w:t>
+            </w:r>
+          </w:p>
+        </w:tc>
+        <w:tc>
+          <w:tcPr>
+            <w:tcW w:type="dxa" w:w="4160"/>
+            <w:tcBorders>
+              <w:top w:val="single" w:color="CCCCCC" w:sz="1"/>
+              <w:left w:val="single" w:color="CCCCCC" w:sz="1"/>
+              <w:bottom w:val="single" w:color="CCCCCC" w:sz="1"/>
+              <w:right w:val="single" w:color="CCCCCC" w:sz="1"/>
+            </w:tcBorders>
+            <w:shd w:fill="FFFFFF" w:val="clear"/>
+            <w:tcMar>
+              <w:top w:type="dxa" w:w="80"/>
+              <w:left w:type="dxa" w:w="120"/>
+              <w:bottom w:type="dxa" w:w="80"/>
+              <w:right w:type="dxa" w:w="120"/>
+            </w:tcMar>
+          </w:tcPr>
+          <w:p>
+            <w:r>
+              <w:t xml:space="preserve">ETL smoke validation gate; lineage audit in etl_batches.jsonl</w:t>
+            </w:r>
+          </w:p>
+        </w:tc>
+      </w:tr>
+      <w:tr>
+        <w:tc>
+          <w:tcPr>
+            <w:tcW w:type="dxa" w:w="2800"/>
+            <w:tcBorders>
+              <w:top w:val="single" w:color="CCCCCC" w:sz="1"/>
+              <w:left w:val="single" w:color="CCCCCC" w:sz="1"/>
+              <w:bottom w:val="single" w:color="CCCCCC" w:sz="1"/>
+              <w:right w:val="single" w:color="CCCCCC" w:sz="1"/>
+            </w:tcBorders>
+            <w:shd w:fill="FFFFFF" w:val="clear"/>
+            <w:tcMar>
+              <w:top w:type="dxa" w:w="80"/>
+              <w:left w:type="dxa" w:w="120"/>
+              <w:bottom w:type="dxa" w:w="80"/>
+              <w:right w:type="dxa" w:w="120"/>
+            </w:tcMar>
+          </w:tcPr>
+          <w:p>
+            <w:r>
+              <w:t xml:space="preserve">Invalid warranty handling</w:t>
+            </w:r>
+          </w:p>
+        </w:tc>
+        <w:tc>
+          <w:tcPr>
+            <w:tcW w:type="dxa" w:w="1200"/>
+            <w:tcBorders>
+              <w:top w:val="single" w:color="CCCCCC" w:sz="1"/>
+              <w:left w:val="single" w:color="CCCCCC" w:sz="1"/>
+              <w:bottom w:val="single" w:color="CCCCCC" w:sz="1"/>
+              <w:right w:val="single" w:color="CCCCCC" w:sz="1"/>
+            </w:tcBorders>
+            <w:shd w:fill="FFFFFF" w:val="clear"/>
+            <w:tcMar>
+              <w:top w:type="dxa" w:w="80"/>
+              <w:left w:type="dxa" w:w="120"/>
+              <w:bottom w:type="dxa" w:w="80"/>
+              <w:right w:type="dxa" w:w="120"/>
+            </w:tcMar>
+          </w:tcPr>
+          <w:p>
+            <w:r>
+              <w:t xml:space="preserve">Medium</w:t>
+            </w:r>
+          </w:p>
+        </w:tc>
+        <w:tc>
+          <w:tcPr>
+            <w:tcW w:type="dxa" w:w="1200"/>
+            <w:tcBorders>
+              <w:top w:val="single" w:color="CCCCCC" w:sz="1"/>
+              <w:left w:val="single" w:color="CCCCCC" w:sz="1"/>
+              <w:bottom w:val="single" w:color="CCCCCC" w:sz="1"/>
+              <w:right w:val="single" w:color="CCCCCC" w:sz="1"/>
+            </w:tcBorders>
+            <w:shd w:fill="FFFFFF" w:val="clear"/>
+            <w:tcMar>
+              <w:top w:type="dxa" w:w="80"/>
+              <w:left w:type="dxa" w:w="120"/>
+              <w:bottom w:type="dxa" w:w="80"/>
+              <w:right w:type="dxa" w:w="120"/>
+            </w:tcMar>
+          </w:tcPr>
+          <w:p>
+            <w:r>
+              <w:t xml:space="preserve">Medium</w:t>
+            </w:r>
+          </w:p>
+        </w:tc>
+        <w:tc>
+          <w:tcPr>
+            <w:tcW w:type="dxa" w:w="4160"/>
+            <w:tcBorders>
+              <w:top w:val="single" w:color="CCCCCC" w:sz="1"/>
+              <w:left w:val="single" w:color="CCCCCC" w:sz="1"/>
+              <w:bottom w:val="single" w:color="CCCCCC" w:sz="1"/>
+              <w:right w:val="single" w:color="CCCCCC" w:sz="1"/>
+            </w:tcBorders>
+            <w:shd w:fill="FFFFFF" w:val="clear"/>
+            <w:tcMar>
+              <w:top w:type="dxa" w:w="80"/>
+              <w:left w:type="dxa" w:w="120"/>
+              <w:bottom w:type="dxa" w:w="80"/>
+              <w:right w:type="dxa" w:w="120"/>
+            </w:tcMar>
+          </w:tcPr>
+          <w:p>
+            <w:r>
+              <w:t xml:space="preserve">CRM asset binding + warranty eligibility gate before diagnosis</w:t>
+            </w:r>
+          </w:p>
+        </w:tc>
+      </w:tr>
+      <w:tr>
+        <w:tc>
+          <w:tcPr>
+            <w:tcW w:type="dxa" w:w="2800"/>
+            <w:tcBorders>
+              <w:top w:val="single" w:color="CCCCCC" w:sz="1"/>
+              <w:left w:val="single" w:color="CCCCCC" w:sz="1"/>
+              <w:bottom w:val="single" w:color="CCCCCC" w:sz="1"/>
+              <w:right w:val="single" w:color="CCCCCC" w:sz="1"/>
+            </w:tcBorders>
+            <w:shd w:fill="FFFFFF" w:val="clear"/>
+            <w:tcMar>
+              <w:top w:type="dxa" w:w="80"/>
+              <w:left w:type="dxa" w:w="120"/>
+              <w:bottom w:type="dxa" w:w="80"/>
+              <w:right w:type="dxa" w:w="120"/>
+            </w:tcMar>
+          </w:tcPr>
+          <w:p>
+            <w:r>
+              <w:t xml:space="preserve">Integration outage</w:t>
+            </w:r>
+          </w:p>
+        </w:tc>
+        <w:tc>
+          <w:tcPr>
+            <w:tcW w:type="dxa" w:w="1200"/>
+            <w:tcBorders>
+              <w:top w:val="single" w:color="CCCCCC" w:sz="1"/>
+              <w:left w:val="single" w:color="CCCCCC" w:sz="1"/>
+              <w:bottom w:val="single" w:color="CCCCCC" w:sz="1"/>
+              <w:right w:val="single" w:color="CCCCCC" w:sz="1"/>
+            </w:tcBorders>
+            <w:shd w:fill="FFFFFF" w:val="clear"/>
+            <w:tcMar>
+              <w:top w:type="dxa" w:w="80"/>
+              <w:left w:type="dxa" w:w="120"/>
+              <w:bottom w:type="dxa" w:w="80"/>
+              <w:right w:type="dxa" w:w="120"/>
+            </w:tcMar>
+          </w:tcPr>
+          <w:p>
+            <w:r>
+              <w:t xml:space="preserve">Medium</w:t>
+            </w:r>
+          </w:p>
+        </w:tc>
+        <w:tc>
+          <w:tcPr>
+            <w:tcW w:type="dxa" w:w="1200"/>
+            <w:tcBorders>
+              <w:top w:val="single" w:color="CCCCCC" w:sz="1"/>
+              <w:left w:val="single" w:color="CCCCCC" w:sz="1"/>
+              <w:bottom w:val="single" w:color="CCCCCC" w:sz="1"/>
+              <w:right w:val="single" w:color="CCCCCC" w:sz="1"/>
+            </w:tcBorders>
+            <w:shd w:fill="FFFFFF" w:val="clear"/>
+            <w:tcMar>
+              <w:top w:type="dxa" w:w="80"/>
+              <w:left w:type="dxa" w:w="120"/>
+              <w:bottom w:type="dxa" w:w="80"/>
+              <w:right w:type="dxa" w:w="120"/>
+            </w:tcMar>
+          </w:tcPr>
+          <w:p>
+            <w:r>
+              <w:t xml:space="preserve">Medium</w:t>
+            </w:r>
+          </w:p>
+        </w:tc>
+        <w:tc>
+          <w:tcPr>
+            <w:tcW w:type="dxa" w:w="4160"/>
+            <w:tcBorders>
+              <w:top w:val="single" w:color="CCCCCC" w:sz="1"/>
+              <w:left w:val="single" w:color="CCCCCC" w:sz="1"/>
+              <w:bottom w:val="single" w:color="CCCCCC" w:sz="1"/>
+              <w:right w:val="single" w:color="CCCCCC" w:sz="1"/>
+            </w:tcBorders>
+            <w:shd w:fill="FFFFFF" w:val="clear"/>
+            <w:tcMar>
+              <w:top w:type="dxa" w:w="80"/>
+              <w:left w:type="dxa" w:w="120"/>
+              <w:bottom w:type="dxa" w:w="80"/>
+              <w:right w:type="dxa" w:w="120"/>
+            </w:tcMar>
+          </w:tcPr>
+          <w:p>
+            <w:r>
+              <w:t xml:space="preserve">Connector fixture fallback; health endpoints on mock and REST APIs</w:t>
+            </w:r>
+          </w:p>
+        </w:tc>
+      </w:tr>
+      <w:tr>
+        <w:tc>
+          <w:tcPr>
+            <w:tcW w:type="dxa" w:w="2800"/>
+            <w:tcBorders>
+              <w:top w:val="single" w:color="CCCCCC" w:sz="1"/>
+              <w:left w:val="single" w:color="CCCCCC" w:sz="1"/>
+              <w:bottom w:val="single" w:color="CCCCCC" w:sz="1"/>
+              <w:right w:val="single" w:color="CCCCCC" w:sz="1"/>
+            </w:tcBorders>
+            <w:shd w:fill="FFFFFF" w:val="clear"/>
+            <w:tcMar>
+              <w:top w:type="dxa" w:w="80"/>
+              <w:left w:type="dxa" w:w="120"/>
+              <w:bottom w:type="dxa" w:w="80"/>
+              <w:right w:type="dxa" w:w="120"/>
+            </w:tcMar>
+          </w:tcPr>
+          <w:p>
+            <w:r>
+              <w:t xml:space="preserve">Unexplainable agent output</w:t>
+            </w:r>
+          </w:p>
+        </w:tc>
+        <w:tc>
+          <w:tcPr>
+            <w:tcW w:type="dxa" w:w="1200"/>
+            <w:tcBorders>
+              <w:top w:val="single" w:color="CCCCCC" w:sz="1"/>
+              <w:left w:val="single" w:color="CCCCCC" w:sz="1"/>
+              <w:bottom w:val="single" w:color="CCCCCC" w:sz="1"/>
+              <w:right w:val="single" w:color="CCCCCC" w:sz="1"/>
+            </w:tcBorders>
+            <w:shd w:fill="FFFFFF" w:val="clear"/>
+            <w:tcMar>
+              <w:top w:type="dxa" w:w="80"/>
+              <w:left w:type="dxa" w:w="120"/>
+              <w:bottom w:type="dxa" w:w="80"/>
+              <w:right w:type="dxa" w:w="120"/>
+            </w:tcMar>
+          </w:tcPr>
+          <w:p>
+            <w:r>
+              <w:t xml:space="preserve">Low</w:t>
+            </w:r>
+          </w:p>
+        </w:tc>
+        <w:tc>
+          <w:tcPr>
+            <w:tcW w:type="dxa" w:w="1200"/>
+            <w:tcBorders>
+              <w:top w:val="single" w:color="CCCCCC" w:sz="1"/>
+              <w:left w:val="single" w:color="CCCCCC" w:sz="1"/>
+              <w:bottom w:val="single" w:color="CCCCCC" w:sz="1"/>
+              <w:right w:val="single" w:color="CCCCCC" w:sz="1"/>
+            </w:tcBorders>
+            <w:shd w:fill="FFFFFF" w:val="clear"/>
+            <w:tcMar>
+              <w:top w:type="dxa" w:w="80"/>
+              <w:left w:type="dxa" w:w="120"/>
+              <w:bottom w:type="dxa" w:w="80"/>
+              <w:right w:type="dxa" w:w="120"/>
+            </w:tcMar>
+          </w:tcPr>
+          <w:p>
+            <w:r>
+              <w:t xml:space="preserve">High</w:t>
+            </w:r>
+          </w:p>
+        </w:tc>
+        <w:tc>
+          <w:tcPr>
+            <w:tcW w:type="dxa" w:w="4160"/>
+            <w:tcBorders>
+              <w:top w:val="single" w:color="CCCCCC" w:sz="1"/>
+              <w:left w:val="single" w:color="CCCCCC" w:sz="1"/>
+              <w:bottom w:val="single" w:color="CCCCCC" w:sz="1"/>
+              <w:right w:val="single" w:color="CCCCCC" w:sz="1"/>
+            </w:tcBorders>
+            <w:shd w:fill="FFFFFF" w:val="clear"/>
+            <w:tcMar>
+              <w:top w:type="dxa" w:w="80"/>
+              <w:left w:type="dxa" w:w="120"/>
+              <w:bottom w:type="dxa" w:w="80"/>
+              <w:right w:type="dxa" w:w="120"/>
+            </w:tcMar>
+          </w:tcPr>
+          <w:p>
+            <w:r>
+              <w:t xml:space="preserve">provenance_trail and evidence[] on every DiagnosisResult</w:t>
+            </w:r>
+          </w:p>
+        </w:tc>
+      </w:tr>
+      <w:tr>
+        <w:tc>
+          <w:tcPr>
+            <w:tcW w:type="dxa" w:w="2800"/>
+            <w:tcBorders>
+              <w:top w:val="single" w:color="CCCCCC" w:sz="1"/>
+              <w:left w:val="single" w:color="CCCCCC" w:sz="1"/>
+              <w:bottom w:val="single" w:color="CCCCCC" w:sz="1"/>
+              <w:right w:val="single" w:color="CCCCCC" w:sz="1"/>
+            </w:tcBorders>
+            <w:shd w:fill="FFFFFF" w:val="clear"/>
+            <w:tcMar>
+              <w:top w:type="dxa" w:w="80"/>
+              <w:left w:type="dxa" w:w="120"/>
+              <w:bottom w:type="dxa" w:w="80"/>
+              <w:right w:type="dxa" w:w="120"/>
+            </w:tcMar>
+          </w:tcPr>
+          <w:p>
+            <w:r>
+              <w:t xml:space="preserve">PII leakage into graph</w:t>
+            </w:r>
+          </w:p>
+        </w:tc>
+        <w:tc>
+          <w:tcPr>
+            <w:tcW w:type="dxa" w:w="1200"/>
+            <w:tcBorders>
+              <w:top w:val="single" w:color="CCCCCC" w:sz="1"/>
+              <w:left w:val="single" w:color="CCCCCC" w:sz="1"/>
+              <w:bottom w:val="single" w:color="CCCCCC" w:sz="1"/>
+              <w:right w:val="single" w:color="CCCCCC" w:sz="1"/>
+            </w:tcBorders>
+            <w:shd w:fill="FFFFFF" w:val="clear"/>
+            <w:tcMar>
+              <w:top w:type="dxa" w:w="80"/>
+              <w:left w:type="dxa" w:w="120"/>
+              <w:bottom w:type="dxa" w:w="80"/>
+              <w:right w:type="dxa" w:w="120"/>
+            </w:tcMar>
+          </w:tcPr>
+          <w:p>
+            <w:r>
+              <w:t xml:space="preserve">Low</w:t>
+            </w:r>
+          </w:p>
+        </w:tc>
+        <w:tc>
+          <w:tcPr>
+            <w:tcW w:type="dxa" w:w="1200"/>
+            <w:tcBorders>
+              <w:top w:val="single" w:color="CCCCCC" w:sz="1"/>
+              <w:left w:val="single" w:color="CCCCCC" w:sz="1"/>
+              <w:bottom w:val="single" w:color="CCCCCC" w:sz="1"/>
+              <w:right w:val="single" w:color="CCCCCC" w:sz="1"/>
+            </w:tcBorders>
+            <w:shd w:fill="FFFFFF" w:val="clear"/>
+            <w:tcMar>
+              <w:top w:type="dxa" w:w="80"/>
+              <w:left w:type="dxa" w:w="120"/>
+              <w:bottom w:type="dxa" w:w="80"/>
+              <w:right w:type="dxa" w:w="120"/>
+            </w:tcMar>
+          </w:tcPr>
+          <w:p>
+            <w:r>
+              <w:t xml:space="preserve">Critical</w:t>
+            </w:r>
+          </w:p>
+        </w:tc>
+        <w:tc>
+          <w:tcPr>
+            <w:tcW w:type="dxa" w:w="4160"/>
+            <w:tcBorders>
+              <w:top w:val="single" w:color="CCCCCC" w:sz="1"/>
+              <w:left w:val="single" w:color="CCCCCC" w:sz="1"/>
+              <w:bottom w:val="single" w:color="CCCCCC" w:sz="1"/>
+              <w:right w:val="single" w:color="CCCCCC" w:sz="1"/>
+            </w:tcBorders>
+            <w:shd w:fill="FFFFFF" w:val="clear"/>
+            <w:tcMar>
+              <w:top w:type="dxa" w:w="80"/>
+              <w:left w:type="dxa" w:w="120"/>
+              <w:bottom w:type="dxa" w:w="80"/>
+              <w:right w:type="dxa" w:w="120"/>
+            </w:tcMar>
+          </w:tcPr>
+          <w:p>
+            <w:r>
+              <w:t xml:space="preserve">Neo4j holds product/diagnostic knowledge only; CRM enriches at runtime</w:t>
+            </w:r>
+          </w:p>
+        </w:tc>
+      </w:tr>
+    </w:tbl>
+    <w:p>
+      <w:pPr>
+        <w:spacing w:after="200"/>
+      </w:pPr>
+    </w:p>
+    <w:p>
+      <w:pPr>
+        <w:pStyle w:val="Heading1"/>
+      </w:pPr>
+      <w:r>
+        <w:t xml:space="preserve">11. Conclusion</w:t>
       </w:r>
     </w:p>
     <w:p>

</xml_diff>